<commit_message>
Day 4: deepen Materi to the plan's Wissen (rule 2.17) with real findings and a structure example
All 12 Wissen bullets are now full: intuitive equals familiar, Baymard checkout abandonment,
Hick-Hyman, depth against breadth, Fitts, WCAG 2.5.8 and 2.5.5, Miller and Cowan, chunking,
one-click ordering. New working example: sixteen help topics in three structures. Minutes
rebalanced to 60; Day 4 added to verify:depth; Word documents of Day 4 rebuilt.

Co-Authored-By: Claude Sonnet 5.5 <noreply@anthropic.com>
</commit_message>
<xml_diff>
--- a/docx/Day4-Materi-AION-UX-Developer-UX-laws-and-cognitive-perception.docx
+++ b/docx/Day4-Materi-AION-UX-Developer-UX-laws-and-cognitive-perception.docx
@@ -631,7 +631,7 @@
               <w:rPr>
                 <w:sz w:val="20"/>
               </w:rPr>
-              <w:t>A3 · Expectations, recognisability and a clear action logic: mental models and Fitts's law · 12 min · Core</w:t>
+              <w:t>A3 · Expectations, recognisability and a clear action logic: mental models and Fitts's law · 13 min · Core</w:t>
             </w:r>
           </w:p>
           <w:p>
@@ -655,7 +655,7 @@
               <w:rPr>
                 <w:sz w:val="20"/>
               </w:rPr>
-              <w:t>A5 · UX laws as tools against friction, and weighing a measure · 12 min · Core</w:t>
+              <w:t>A5 · UX laws as tools against friction, and weighing a measure · 11 min · Core</w:t>
             </w:r>
           </w:p>
           <w:p>
@@ -2398,7 +2398,7 @@
             </w:r>
             <w:r>
               <w:rPr/>
-              <w:t xml:space="preserve"> First the four steps from seeing to acting. Then the same Pedalo screen twice: designed to look simple and designed to be intuitive.</w:t>
+              <w:t xml:space="preserve"> First the four steps from seeing to acting. Then the same Pedalo screen twice: designed to look simple and designed to be intuitive. Tables of the evidence follow.</w:t>
             </w:r>
           </w:p>
         </w:tc>
@@ -2832,6 +2832,319 @@
         <w:spacing w:before="0" w:after="80"/>
       </w:pPr>
     </w:p>
+    <w:p>
+      <w:pPr>
+        <w:spacing w:before="0" w:after="100"/>
+      </w:pPr>
+      <w:r>
+        <w:rPr>
+          <w:b/>
+        </w:rPr>
+        <w:t>Intuitive use is designed: evidence</w:t>
+      </w:r>
+    </w:p>
+    <w:tbl>
+      <w:tblPr>
+        <w:tblW w:w="9638" w:type="dxa"/>
+        <w:tblBorders>
+          <w:top w:val="single" w:sz="4" w:space="0" w:color="D5DEE9"/>
+          <w:left w:val="single" w:sz="4" w:space="0" w:color="D5DEE9"/>
+          <w:bottom w:val="single" w:sz="4" w:space="0" w:color="D5DEE9"/>
+          <w:right w:val="single" w:sz="4" w:space="0" w:color="D5DEE9"/>
+          <w:insideH w:val="single" w:sz="4" w:space="0" w:color="D5DEE9"/>
+          <w:insideV w:val="single" w:sz="4" w:space="0" w:color="D5DEE9"/>
+        </w:tblBorders>
+        <w:tblLayout w:type="fixed"/>
+        <w:tblCellMar>
+          <w:top w:w="60" w:type="dxa"/>
+          <w:left w:w="100" w:type="dxa"/>
+          <w:bottom w:w="60" w:type="dxa"/>
+          <w:right w:w="100" w:type="dxa"/>
+        </w:tblCellMar>
+      </w:tblPr>
+      <w:tblGrid>
+        <w:gridCol w:w="1873"/>
+        <w:gridCol w:w="4828"/>
+        <w:gridCol w:w="2937"/>
+      </w:tblGrid>
+      <w:tr>
+        <w:trPr>
+          <w:cantSplit/>
+          <w:tblHeader/>
+        </w:trPr>
+        <w:tc>
+          <w:tcPr>
+            <w:tcW w:type="dxa" w:w="1873"/>
+            <w:shd w:val="clear" w:color="auto" w:fill="E6ECF4"/>
+          </w:tcPr>
+          <w:p>
+            <w:pPr>
+              <w:spacing w:before="0" w:after="0"/>
+            </w:pPr>
+            <w:r>
+              <w:rPr>
+                <w:b/>
+                <w:sz w:val="20"/>
+              </w:rPr>
+              <w:t>Idea</w:t>
+            </w:r>
+          </w:p>
+        </w:tc>
+        <w:tc>
+          <w:tcPr>
+            <w:tcW w:type="dxa" w:w="4828"/>
+            <w:shd w:val="clear" w:color="auto" w:fill="E6ECF4"/>
+          </w:tcPr>
+          <w:p>
+            <w:pPr>
+              <w:spacing w:before="0" w:after="0"/>
+            </w:pPr>
+            <w:r>
+              <w:rPr>
+                <w:b/>
+                <w:sz w:val="20"/>
+              </w:rPr>
+              <w:t>Real finding</w:t>
+            </w:r>
+          </w:p>
+        </w:tc>
+        <w:tc>
+          <w:tcPr>
+            <w:tcW w:type="dxa" w:w="2937"/>
+            <w:shd w:val="clear" w:color="auto" w:fill="E6ECF4"/>
+          </w:tcPr>
+          <w:p>
+            <w:pPr>
+              <w:spacing w:before="0" w:after="0"/>
+            </w:pPr>
+            <w:r>
+              <w:rPr>
+                <w:b/>
+                <w:sz w:val="20"/>
+              </w:rPr>
+              <w:t>What it means for a screen</w:t>
+            </w:r>
+          </w:p>
+        </w:tc>
+      </w:tr>
+      <w:tr>
+        <w:trPr>
+          <w:cantSplit/>
+        </w:trPr>
+        <w:tc>
+          <w:tcPr>
+            <w:tcW w:type="dxa" w:w="1873"/>
+          </w:tcPr>
+          <w:p>
+            <w:pPr>
+              <w:spacing w:before="0" w:after="0"/>
+            </w:pPr>
+            <w:r>
+              <w:rPr>
+                <w:sz w:val="20"/>
+              </w:rPr>
+              <w:t>Intuitive means familiar</w:t>
+            </w:r>
+          </w:p>
+        </w:tc>
+        <w:tc>
+          <w:tcPr>
+            <w:tcW w:type="dxa" w:w="4828"/>
+          </w:tcPr>
+          <w:p>
+            <w:pPr>
+              <w:spacing w:before="0" w:after="0"/>
+            </w:pPr>
+            <w:r>
+              <w:rPr>
+                <w:sz w:val="20"/>
+              </w:rPr>
+              <w:t>Jef Raskin argued in 1994 that “intuitive” in practice means familiar: an interface is intuitive when it uses skills people already have (Raskin 1994).</w:t>
+            </w:r>
+          </w:p>
+        </w:tc>
+        <w:tc>
+          <w:tcPr>
+            <w:tcW w:type="dxa" w:w="2937"/>
+          </w:tcPr>
+          <w:p>
+            <w:pPr>
+              <w:spacing w:before="0" w:after="0"/>
+            </w:pPr>
+            <w:r>
+              <w:rPr>
+                <w:sz w:val="20"/>
+              </w:rPr>
+              <w:t>A new layout is intuitive only for people who know its pattern: start from patterns your users already know.</w:t>
+            </w:r>
+          </w:p>
+        </w:tc>
+      </w:tr>
+      <w:tr>
+        <w:trPr>
+          <w:cantSplit/>
+        </w:trPr>
+        <w:tc>
+          <w:tcPr>
+            <w:tcW w:type="dxa" w:w="1873"/>
+          </w:tcPr>
+          <w:p>
+            <w:pPr>
+              <w:spacing w:before="0" w:after="0"/>
+            </w:pPr>
+            <w:r>
+              <w:rPr>
+                <w:sz w:val="20"/>
+              </w:rPr>
+              <w:t>Perception, attention, memory, action</w:t>
+            </w:r>
+          </w:p>
+        </w:tc>
+        <w:tc>
+          <w:tcPr>
+            <w:tcW w:type="dxa" w:w="4828"/>
+          </w:tcPr>
+          <w:p>
+            <w:pPr>
+              <w:spacing w:before="0" w:after="0"/>
+            </w:pPr>
+            <w:r>
+              <w:rPr>
+                <w:sz w:val="20"/>
+              </w:rPr>
+              <w:t>The eyes rest for about 200 to 300 ms per fixation (Rayner 1998), and working memory holds about four chunks (Cowan 2001).</w:t>
+            </w:r>
+          </w:p>
+        </w:tc>
+        <w:tc>
+          <w:tcPr>
+            <w:tcW w:type="dxa" w:w="2937"/>
+          </w:tcPr>
+          <w:p>
+            <w:pPr>
+              <w:spacing w:before="0" w:after="0"/>
+            </w:pPr>
+            <w:r>
+              <w:rPr>
+                <w:sz w:val="20"/>
+              </w:rPr>
+              <w:t>What a person must notice, hold and decide in one step has to fit in that budget.</w:t>
+            </w:r>
+          </w:p>
+        </w:tc>
+      </w:tr>
+      <w:tr>
+        <w:trPr>
+          <w:cantSplit/>
+        </w:trPr>
+        <w:tc>
+          <w:tcPr>
+            <w:tcW w:type="dxa" w:w="1873"/>
+          </w:tcPr>
+          <w:p>
+            <w:pPr>
+              <w:spacing w:before="0" w:after="0"/>
+            </w:pPr>
+            <w:r>
+              <w:rPr>
+                <w:sz w:val="20"/>
+              </w:rPr>
+              <w:t>Friction has a price</w:t>
+            </w:r>
+          </w:p>
+        </w:tc>
+        <w:tc>
+          <w:tcPr>
+            <w:tcW w:type="dxa" w:w="4828"/>
+          </w:tcPr>
+          <w:p>
+            <w:pPr>
+              <w:spacing w:before="0" w:after="0"/>
+            </w:pPr>
+            <w:r>
+              <w:rPr>
+                <w:sz w:val="20"/>
+              </w:rPr>
+              <w:t>In Baymard's quantitative study, 17% of the US online shoppers had abandoned an order in the past quarter because the checkout seemed too long or complicated; the average cart abandonment rate across all reasons is 70.19% (Baymard Institute 2024).</w:t>
+            </w:r>
+          </w:p>
+        </w:tc>
+        <w:tc>
+          <w:tcPr>
+            <w:tcW w:type="dxa" w:w="2937"/>
+          </w:tcPr>
+          <w:p>
+            <w:pPr>
+              <w:spacing w:before="0" w:after="0"/>
+            </w:pPr>
+            <w:r>
+              <w:rPr>
+                <w:sz w:val="20"/>
+              </w:rPr>
+              <w:t>A step that is hard to follow costs completions, not only comfort.</w:t>
+            </w:r>
+          </w:p>
+        </w:tc>
+      </w:tr>
+      <w:tr>
+        <w:trPr>
+          <w:cantSplit/>
+        </w:trPr>
+        <w:tc>
+          <w:tcPr>
+            <w:tcW w:type="dxa" w:w="1873"/>
+          </w:tcPr>
+          <w:p>
+            <w:pPr>
+              <w:spacing w:before="0" w:after="0"/>
+            </w:pPr>
+            <w:r>
+              <w:rPr>
+                <w:sz w:val="20"/>
+              </w:rPr>
+              <w:t>Simple surface or intuitive guidance</w:t>
+            </w:r>
+          </w:p>
+        </w:tc>
+        <w:tc>
+          <w:tcPr>
+            <w:tcW w:type="dxa" w:w="4828"/>
+          </w:tcPr>
+          <w:p>
+            <w:pPr>
+              <w:spacing w:before="0" w:after="0"/>
+            </w:pPr>
+            <w:r>
+              <w:rPr>
+                <w:sz w:val="20"/>
+              </w:rPr>
+              <w:t>ISO 9241-110 asks for self-descriptiveness and conformity with user expectations, not for few elements (ISO 9241-110).</w:t>
+            </w:r>
+          </w:p>
+        </w:tc>
+        <w:tc>
+          <w:tcPr>
+            <w:tcW w:type="dxa" w:w="2937"/>
+          </w:tcPr>
+          <w:p>
+            <w:pPr>
+              <w:spacing w:before="0" w:after="0"/>
+            </w:pPr>
+            <w:r>
+              <w:rPr>
+                <w:sz w:val="20"/>
+              </w:rPr>
+              <w:t>Judge a screen by whether people finish the task without thinking about the interface, not by how clean it looks.</w:t>
+            </w:r>
+          </w:p>
+        </w:tc>
+      </w:tr>
+    </w:tbl>
+    <w:p>
+      <w:pPr>
+        <w:spacing w:before="0" w:after="80"/>
+      </w:pPr>
+    </w:p>
     <w:tbl>
       <w:tblPr>
         <w:tblW w:w="9598" w:type="dxa"/>
@@ -2881,7 +3194,7 @@
             </w:pPr>
             <w:r>
               <w:rPr/>
-              <w:t>Pedalo, Nina, Sam, Yusuf and Clara are made up for this example. Designing for how people perceive and act follows Norman (2013); the interaction principles (suitability for the task, self-descriptiveness, conformity with expectations) follow ISO 9241-110.</w:t>
+              <w:t>Pedalo, Nina, Sam, Yusuf and Clara are made up for this example. Designing for how people perceive and act follows Norman (2013); the interaction principles (suitability for the task, self-descriptiveness, conformity with expectations) follow ISO 9241-110. The findings in the table of real evidence are real research results, rules and cases; the sources are listed below.</w:t>
             </w:r>
           </w:p>
         </w:tc>
@@ -3060,7 +3373,7 @@
           <w:color w:val="556274"/>
           <w:sz w:val="18"/>
         </w:rPr>
-        <w:t>Norman 2013 · ISO 9241-110 · Krug 2014</w:t>
+        <w:t>Norman 2013 · ISO 9241-110 · Krug 2014 · Raskin 1994 · Baymard Institute 2024 · Rayner 1998 · Cowan 2001</w:t>
       </w:r>
     </w:p>
     <w:p>
@@ -3174,7 +3487,7 @@
             </w:r>
             <w:r>
               <w:rPr/>
-              <w:t xml:space="preserve"> One Pedalo pass page in two forms: twelve equal passes, and three recommended passes with “All passes” below.</w:t>
+              <w:t xml:space="preserve"> One Pedalo pass page in two forms: twelve equal passes, and three recommended passes with “All passes” below. Then a second working example, the help topics in three structures, and a table of findings on choice.</w:t>
             </w:r>
           </w:p>
         </w:tc>
@@ -3553,6 +3866,266 @@
         <w:spacing w:before="0" w:after="80"/>
       </w:pPr>
     </w:p>
+    <w:p>
+      <w:pPr>
+        <w:spacing w:before="0" w:after="100"/>
+      </w:pPr>
+      <w:r>
+        <w:rPr>
+          <w:b/>
+        </w:rPr>
+        <w:t>Choice and decision time: findings</w:t>
+      </w:r>
+    </w:p>
+    <w:tbl>
+      <w:tblPr>
+        <w:tblW w:w="9638" w:type="dxa"/>
+        <w:tblBorders>
+          <w:top w:val="single" w:sz="4" w:space="0" w:color="D5DEE9"/>
+          <w:left w:val="single" w:sz="4" w:space="0" w:color="D5DEE9"/>
+          <w:bottom w:val="single" w:sz="4" w:space="0" w:color="D5DEE9"/>
+          <w:right w:val="single" w:sz="4" w:space="0" w:color="D5DEE9"/>
+          <w:insideH w:val="single" w:sz="4" w:space="0" w:color="D5DEE9"/>
+          <w:insideV w:val="single" w:sz="4" w:space="0" w:color="D5DEE9"/>
+        </w:tblBorders>
+        <w:tblLayout w:type="fixed"/>
+        <w:tblCellMar>
+          <w:top w:w="60" w:type="dxa"/>
+          <w:left w:w="100" w:type="dxa"/>
+          <w:bottom w:w="60" w:type="dxa"/>
+          <w:right w:w="100" w:type="dxa"/>
+        </w:tblCellMar>
+      </w:tblPr>
+      <w:tblGrid>
+        <w:gridCol w:w="1635"/>
+        <w:gridCol w:w="4547"/>
+        <w:gridCol w:w="3456"/>
+      </w:tblGrid>
+      <w:tr>
+        <w:trPr>
+          <w:cantSplit/>
+          <w:tblHeader/>
+        </w:trPr>
+        <w:tc>
+          <w:tcPr>
+            <w:tcW w:type="dxa" w:w="1635"/>
+            <w:shd w:val="clear" w:color="auto" w:fill="E6ECF4"/>
+          </w:tcPr>
+          <w:p>
+            <w:pPr>
+              <w:spacing w:before="0" w:after="0"/>
+            </w:pPr>
+            <w:r>
+              <w:rPr>
+                <w:b/>
+                <w:sz w:val="20"/>
+              </w:rPr>
+              <w:t>Finding</w:t>
+            </w:r>
+          </w:p>
+        </w:tc>
+        <w:tc>
+          <w:tcPr>
+            <w:tcW w:type="dxa" w:w="4547"/>
+            <w:shd w:val="clear" w:color="auto" w:fill="E6ECF4"/>
+          </w:tcPr>
+          <w:p>
+            <w:pPr>
+              <w:spacing w:before="0" w:after="0"/>
+            </w:pPr>
+            <w:r>
+              <w:rPr>
+                <w:b/>
+                <w:sz w:val="20"/>
+              </w:rPr>
+              <w:t>What was measured</w:t>
+            </w:r>
+          </w:p>
+        </w:tc>
+        <w:tc>
+          <w:tcPr>
+            <w:tcW w:type="dxa" w:w="3456"/>
+            <w:shd w:val="clear" w:color="auto" w:fill="E6ECF4"/>
+          </w:tcPr>
+          <w:p>
+            <w:pPr>
+              <w:spacing w:before="0" w:after="0"/>
+            </w:pPr>
+            <w:r>
+              <w:rPr>
+                <w:b/>
+                <w:sz w:val="20"/>
+              </w:rPr>
+              <w:t>What it means for a screen</w:t>
+            </w:r>
+          </w:p>
+        </w:tc>
+      </w:tr>
+      <w:tr>
+        <w:trPr>
+          <w:cantSplit/>
+        </w:trPr>
+        <w:tc>
+          <w:tcPr>
+            <w:tcW w:type="dxa" w:w="1635"/>
+          </w:tcPr>
+          <w:p>
+            <w:pPr>
+              <w:spacing w:before="0" w:after="0"/>
+            </w:pPr>
+            <w:r>
+              <w:rPr>
+                <w:sz w:val="20"/>
+              </w:rPr>
+              <w:t>Hick-Hyman law</w:t>
+            </w:r>
+          </w:p>
+        </w:tc>
+        <w:tc>
+          <w:tcPr>
+            <w:tcW w:type="dxa" w:w="4547"/>
+          </w:tcPr>
+          <w:p>
+            <w:pPr>
+              <w:spacing w:before="0" w:after="0"/>
+            </w:pPr>
+            <w:r>
+              <w:rPr>
+                <w:sz w:val="20"/>
+              </w:rPr>
+              <w:t>The time to choose grows with the logarithm of the number of equally likely alternatives, RT = a + b·log2(n + 1) (Hick 1952; Hyman 1953).</w:t>
+            </w:r>
+          </w:p>
+        </w:tc>
+        <w:tc>
+          <w:tcPr>
+            <w:tcW w:type="dxa" w:w="3456"/>
+          </w:tcPr>
+          <w:p>
+            <w:pPr>
+              <w:spacing w:before="0" w:after="0"/>
+            </w:pPr>
+            <w:r>
+              <w:rPr>
+                <w:sz w:val="20"/>
+              </w:rPr>
+              <w:t>Each added option costs time, a little less each time. The law holds for unfamiliar, equally likely options, not for sorted lists people know.</w:t>
+            </w:r>
+          </w:p>
+        </w:tc>
+      </w:tr>
+      <w:tr>
+        <w:trPr>
+          <w:cantSplit/>
+        </w:trPr>
+        <w:tc>
+          <w:tcPr>
+            <w:tcW w:type="dxa" w:w="1635"/>
+          </w:tcPr>
+          <w:p>
+            <w:pPr>
+              <w:spacing w:before="0" w:after="0"/>
+            </w:pPr>
+            <w:r>
+              <w:rPr>
+                <w:sz w:val="20"/>
+              </w:rPr>
+              <w:t>Depth against breadth</w:t>
+            </w:r>
+          </w:p>
+        </w:tc>
+        <w:tc>
+          <w:tcPr>
+            <w:tcW w:type="dxa" w:w="4547"/>
+          </w:tcPr>
+          <w:p>
+            <w:pPr>
+              <w:spacing w:before="0" w:after="0"/>
+            </w:pPr>
+            <w:r>
+              <w:rPr>
+                <w:sz w:val="20"/>
+              </w:rPr>
+              <w:t>In a study of web structures, more depth harmed search performance, and a medium structure of depth and breadth beat the broadest, shallowest one (Larson and Czerwinski 1998).</w:t>
+            </w:r>
+          </w:p>
+        </w:tc>
+        <w:tc>
+          <w:tcPr>
+            <w:tcW w:type="dxa" w:w="3456"/>
+          </w:tcPr>
+          <w:p>
+            <w:pPr>
+              <w:spacing w:before="0" w:after="0"/>
+            </w:pPr>
+            <w:r>
+              <w:rPr>
+                <w:sz w:val="20"/>
+              </w:rPr>
+              <w:t>Do not flatten everything into one long menu, and do not hide items under many levels: group into a few clear levels.</w:t>
+            </w:r>
+          </w:p>
+        </w:tc>
+      </w:tr>
+      <w:tr>
+        <w:trPr>
+          <w:cantSplit/>
+        </w:trPr>
+        <w:tc>
+          <w:tcPr>
+            <w:tcW w:type="dxa" w:w="1635"/>
+          </w:tcPr>
+          <w:p>
+            <w:pPr>
+              <w:spacing w:before="0" w:after="0"/>
+            </w:pPr>
+            <w:r>
+              <w:rPr>
+                <w:sz w:val="20"/>
+              </w:rPr>
+              <w:t>Choice overload</w:t>
+            </w:r>
+          </w:p>
+        </w:tc>
+        <w:tc>
+          <w:tcPr>
+            <w:tcW w:type="dxa" w:w="4547"/>
+          </w:tcPr>
+          <w:p>
+            <w:pPr>
+              <w:spacing w:before="0" w:after="0"/>
+            </w:pPr>
+            <w:r>
+              <w:rPr>
+                <w:sz w:val="20"/>
+              </w:rPr>
+              <w:t>A display of 24 jams drew more stops and far fewer purchases than a display of 6 (Iyengar and Lepper 2000; a small study, with later mixed results).</w:t>
+            </w:r>
+          </w:p>
+        </w:tc>
+        <w:tc>
+          <w:tcPr>
+            <w:tcW w:type="dxa" w:w="3456"/>
+          </w:tcPr>
+          <w:p>
+            <w:pPr>
+              <w:spacing w:before="0" w:after="0"/>
+            </w:pPr>
+            <w:r>
+              <w:rPr>
+                <w:sz w:val="20"/>
+              </w:rPr>
+              <w:t>Recommend a few options first and keep the rest one step away.</w:t>
+            </w:r>
+          </w:p>
+        </w:tc>
+      </w:tr>
+    </w:tbl>
+    <w:p>
+      <w:pPr>
+        <w:spacing w:before="0" w:after="80"/>
+      </w:pPr>
+    </w:p>
     <w:tbl>
       <w:tblPr>
         <w:tblW w:w="9598" w:type="dxa"/>
@@ -3602,7 +4175,7 @@
             </w:pPr>
             <w:r>
               <w:rPr/>
-              <w:t>Pedalo, Nina, Sam, Yusuf and Clara are made up for this example. Hick's law follows Hick (1952) and Hyman (1953); that many options can make people choose less follows Iyengar and Lepper (2000).</w:t>
+              <w:t>Pedalo, Nina, Sam, Yusuf and Clara are made up for this example. Hick's law follows Hick (1952) and Hyman (1953); that many options can make people choose less follows Iyengar and Lepper (2000). The findings in the table of real evidence are real research results, rules and cases; the sources are listed below.</w:t>
             </w:r>
           </w:p>
         </w:tc>
@@ -3791,7 +4364,7 @@
           <w:color w:val="556274"/>
           <w:sz w:val="18"/>
         </w:rPr>
-        <w:t>Hick 1952 · Hyman 1953 · Iyengar &amp; Lepper 2000 · Yablonski 2020</w:t>
+        <w:t>Hick 1952 · Hyman 1953 · Iyengar &amp; Lepper 2000 · Yablonski 2020 · Larson &amp; Czerwinski 1998</w:t>
       </w:r>
     </w:p>
     <w:p>
@@ -3800,7 +4373,7 @@
       </w:pPr>
       <w:r>
         <w:rPr/>
-        <w:t>A3 · Expectations, recognisability and a clear action logic: mental models and Fitts's law · 12 min · Core</w:t>
+        <w:t>A3 · Expectations, recognisability and a clear action logic: mental models and Fitts's law · 13 min · Core</w:t>
       </w:r>
     </w:p>
     <w:p>
@@ -3905,7 +4478,7 @@
             </w:r>
             <w:r>
               <w:rPr/>
-              <w:t xml:space="preserve"> One Pedalo screen with three switches: the button where people expect it, a large target near the thumb, and the same pattern on every screen.</w:t>
+              <w:t xml:space="preserve"> One Pedalo screen with three switches: the button where people expect it, a large target near the thumb, and the same pattern on every screen. A table of the numbers and rules for targets, expectations and mental models follows.</w:t>
             </w:r>
           </w:p>
         </w:tc>
@@ -4284,6 +4857,319 @@
         <w:spacing w:before="0" w:after="80"/>
       </w:pPr>
     </w:p>
+    <w:p>
+      <w:pPr>
+        <w:spacing w:before="0" w:after="100"/>
+      </w:pPr>
+      <w:r>
+        <w:rPr>
+          <w:b/>
+        </w:rPr>
+        <w:t>Targets, expectations and mental models: numbers and rules</w:t>
+      </w:r>
+    </w:p>
+    <w:tbl>
+      <w:tblPr>
+        <w:tblW w:w="9638" w:type="dxa"/>
+        <w:tblBorders>
+          <w:top w:val="single" w:sz="4" w:space="0" w:color="D5DEE9"/>
+          <w:left w:val="single" w:sz="4" w:space="0" w:color="D5DEE9"/>
+          <w:bottom w:val="single" w:sz="4" w:space="0" w:color="D5DEE9"/>
+          <w:right w:val="single" w:sz="4" w:space="0" w:color="D5DEE9"/>
+          <w:insideH w:val="single" w:sz="4" w:space="0" w:color="D5DEE9"/>
+          <w:insideV w:val="single" w:sz="4" w:space="0" w:color="D5DEE9"/>
+        </w:tblBorders>
+        <w:tblLayout w:type="fixed"/>
+        <w:tblCellMar>
+          <w:top w:w="60" w:type="dxa"/>
+          <w:left w:w="100" w:type="dxa"/>
+          <w:bottom w:w="60" w:type="dxa"/>
+          <w:right w:w="100" w:type="dxa"/>
+        </w:tblCellMar>
+      </w:tblPr>
+      <w:tblGrid>
+        <w:gridCol w:w="1844"/>
+        <w:gridCol w:w="4814"/>
+        <w:gridCol w:w="2980"/>
+      </w:tblGrid>
+      <w:tr>
+        <w:trPr>
+          <w:cantSplit/>
+          <w:tblHeader/>
+        </w:trPr>
+        <w:tc>
+          <w:tcPr>
+            <w:tcW w:type="dxa" w:w="1844"/>
+            <w:shd w:val="clear" w:color="auto" w:fill="E6ECF4"/>
+          </w:tcPr>
+          <w:p>
+            <w:pPr>
+              <w:spacing w:before="0" w:after="0"/>
+            </w:pPr>
+            <w:r>
+              <w:rPr>
+                <w:b/>
+                <w:sz w:val="20"/>
+              </w:rPr>
+              <w:t>Topic</w:t>
+            </w:r>
+          </w:p>
+        </w:tc>
+        <w:tc>
+          <w:tcPr>
+            <w:tcW w:type="dxa" w:w="4814"/>
+            <w:shd w:val="clear" w:color="auto" w:fill="E6ECF4"/>
+          </w:tcPr>
+          <w:p>
+            <w:pPr>
+              <w:spacing w:before="0" w:after="0"/>
+            </w:pPr>
+            <w:r>
+              <w:rPr>
+                <w:b/>
+                <w:sz w:val="20"/>
+              </w:rPr>
+              <w:t>Real rule or finding</w:t>
+            </w:r>
+          </w:p>
+        </w:tc>
+        <w:tc>
+          <w:tcPr>
+            <w:tcW w:type="dxa" w:w="2980"/>
+            <w:shd w:val="clear" w:color="auto" w:fill="E6ECF4"/>
+          </w:tcPr>
+          <w:p>
+            <w:pPr>
+              <w:spacing w:before="0" w:after="0"/>
+            </w:pPr>
+            <w:r>
+              <w:rPr>
+                <w:b/>
+                <w:sz w:val="20"/>
+              </w:rPr>
+              <w:t>What to check</w:t>
+            </w:r>
+          </w:p>
+        </w:tc>
+      </w:tr>
+      <w:tr>
+        <w:trPr>
+          <w:cantSplit/>
+        </w:trPr>
+        <w:tc>
+          <w:tcPr>
+            <w:tcW w:type="dxa" w:w="1844"/>
+          </w:tcPr>
+          <w:p>
+            <w:pPr>
+              <w:spacing w:before="0" w:after="0"/>
+            </w:pPr>
+            <w:r>
+              <w:rPr>
+                <w:sz w:val="20"/>
+              </w:rPr>
+              <w:t>Fitts's law</w:t>
+            </w:r>
+          </w:p>
+        </w:tc>
+        <w:tc>
+          <w:tcPr>
+            <w:tcW w:type="dxa" w:w="4814"/>
+          </w:tcPr>
+          <w:p>
+            <w:pPr>
+              <w:spacing w:before="0" w:after="0"/>
+            </w:pPr>
+            <w:r>
+              <w:rPr>
+                <w:sz w:val="20"/>
+              </w:rPr>
+              <w:t>The time to hit a target grows with its distance D and shrinks with its width W, MT = a + b·log2(2D/W) (Fitts 1954).</w:t>
+            </w:r>
+          </w:p>
+        </w:tc>
+        <w:tc>
+          <w:tcPr>
+            <w:tcW w:type="dxa" w:w="2980"/>
+          </w:tcPr>
+          <w:p>
+            <w:pPr>
+              <w:spacing w:before="0" w:after="0"/>
+            </w:pPr>
+            <w:r>
+              <w:rPr>
+                <w:sz w:val="20"/>
+              </w:rPr>
+              <w:t>Make the main target large and near the thumb or the pointer; do not put it in a far corner.</w:t>
+            </w:r>
+          </w:p>
+        </w:tc>
+      </w:tr>
+      <w:tr>
+        <w:trPr>
+          <w:cantSplit/>
+        </w:trPr>
+        <w:tc>
+          <w:tcPr>
+            <w:tcW w:type="dxa" w:w="1844"/>
+          </w:tcPr>
+          <w:p>
+            <w:pPr>
+              <w:spacing w:before="0" w:after="0"/>
+            </w:pPr>
+            <w:r>
+              <w:rPr>
+                <w:sz w:val="20"/>
+              </w:rPr>
+              <w:t>Target size</w:t>
+            </w:r>
+          </w:p>
+        </w:tc>
+        <w:tc>
+          <w:tcPr>
+            <w:tcW w:type="dxa" w:w="4814"/>
+          </w:tcPr>
+          <w:p>
+            <w:pPr>
+              <w:spacing w:before="0" w:after="0"/>
+            </w:pPr>
+            <w:r>
+              <w:rPr>
+                <w:sz w:val="20"/>
+              </w:rPr>
+              <w:t>WCAG 2.2 asks for pointer targets of at least 24 by 24 CSS pixels at level AA (2.5.8, with a spacing exception) and 44 by 44 at level AAA (2.5.5); the platform guidelines of Apple and Google give 44 points and 48 dp (Apple; as commonly given).</w:t>
+            </w:r>
+          </w:p>
+        </w:tc>
+        <w:tc>
+          <w:tcPr>
+            <w:tcW w:type="dxa" w:w="2980"/>
+          </w:tcPr>
+          <w:p>
+            <w:pPr>
+              <w:spacing w:before="0" w:after="0"/>
+            </w:pPr>
+            <w:r>
+              <w:rPr>
+                <w:sz w:val="20"/>
+              </w:rPr>
+              <w:t>Measure the tap area, not the icon, and keep the targets apart.</w:t>
+            </w:r>
+          </w:p>
+        </w:tc>
+      </w:tr>
+      <w:tr>
+        <w:trPr>
+          <w:cantSplit/>
+        </w:trPr>
+        <w:tc>
+          <w:tcPr>
+            <w:tcW w:type="dxa" w:w="1844"/>
+          </w:tcPr>
+          <w:p>
+            <w:pPr>
+              <w:spacing w:before="0" w:after="0"/>
+            </w:pPr>
+            <w:r>
+              <w:rPr>
+                <w:sz w:val="20"/>
+              </w:rPr>
+              <w:t>Conformity with expectations</w:t>
+            </w:r>
+          </w:p>
+        </w:tc>
+        <w:tc>
+          <w:tcPr>
+            <w:tcW w:type="dxa" w:w="4814"/>
+          </w:tcPr>
+          <w:p>
+            <w:pPr>
+              <w:spacing w:before="0" w:after="0"/>
+            </w:pPr>
+            <w:r>
+              <w:rPr>
+                <w:sz w:val="20"/>
+              </w:rPr>
+              <w:t>Users spend most of their time on other sites, so they expect yours to work like those (Nielsen 2000, Jakob's law). Consistency and standards are one of the ten heuristics (Nielsen 1994).</w:t>
+            </w:r>
+          </w:p>
+        </w:tc>
+        <w:tc>
+          <w:tcPr>
+            <w:tcW w:type="dxa" w:w="2980"/>
+          </w:tcPr>
+          <w:p>
+            <w:pPr>
+              <w:spacing w:before="0" w:after="0"/>
+            </w:pPr>
+            <w:r>
+              <w:rPr>
+                <w:sz w:val="20"/>
+              </w:rPr>
+              <w:t>Put the main action where other products put it, and let one element do one thing everywhere.</w:t>
+            </w:r>
+          </w:p>
+        </w:tc>
+      </w:tr>
+      <w:tr>
+        <w:trPr>
+          <w:cantSplit/>
+        </w:trPr>
+        <w:tc>
+          <w:tcPr>
+            <w:tcW w:type="dxa" w:w="1844"/>
+          </w:tcPr>
+          <w:p>
+            <w:pPr>
+              <w:spacing w:before="0" w:after="0"/>
+            </w:pPr>
+            <w:r>
+              <w:rPr>
+                <w:sz w:val="20"/>
+              </w:rPr>
+              <w:t>Mental models</w:t>
+            </w:r>
+          </w:p>
+        </w:tc>
+        <w:tc>
+          <w:tcPr>
+            <w:tcW w:type="dxa" w:w="4814"/>
+          </w:tcPr>
+          <w:p>
+            <w:pPr>
+              <w:spacing w:before="0" w:after="0"/>
+            </w:pPr>
+            <w:r>
+              <w:rPr>
+                <w:sz w:val="20"/>
+              </w:rPr>
+              <w:t>People form a model of how a thing works from what they see; when the system works differently, errors follow (Norman 2013).</w:t>
+            </w:r>
+          </w:p>
+        </w:tc>
+        <w:tc>
+          <w:tcPr>
+            <w:tcW w:type="dxa" w:w="2980"/>
+          </w:tcPr>
+          <w:p>
+            <w:pPr>
+              <w:spacing w:before="0" w:after="0"/>
+            </w:pPr>
+            <w:r>
+              <w:rPr>
+                <w:sz w:val="20"/>
+              </w:rPr>
+              <w:t>Name things in the words users use, and show the state of the system.</w:t>
+            </w:r>
+          </w:p>
+        </w:tc>
+      </w:tr>
+    </w:tbl>
+    <w:p>
+      <w:pPr>
+        <w:spacing w:before="0" w:after="80"/>
+      </w:pPr>
+    </w:p>
     <w:tbl>
       <w:tblPr>
         <w:tblW w:w="9598" w:type="dxa"/>
@@ -4333,7 +5219,7 @@
             </w:pPr>
             <w:r>
               <w:rPr/>
-              <w:t>Pedalo, Nina, Sam, Yusuf and Clara are made up for this example. Mental models follow Norman (2013); Fitts's law follows Fitts (1954); conformity with user expectations is an interaction principle of ISO 9241-110; Jakob's law is described by Yablonski (2020).</w:t>
+              <w:t>Pedalo, Nina, Sam, Yusuf and Clara are made up for this example. Mental models follow Norman (2013); Fitts's law follows Fitts (1954); conformity with user expectations is an interaction principle of ISO 9241-110; Jakob's law is described by Yablonski (2020). The findings in the table of real evidence are real research results, rules and cases; the sources are listed below.</w:t>
             </w:r>
           </w:p>
         </w:tc>
@@ -4522,7 +5408,7 @@
           <w:color w:val="556274"/>
           <w:sz w:val="18"/>
         </w:rPr>
-        <w:t>Norman 2013 · Fitts 1954 · ISO 9241-110 · Yablonski 2020</w:t>
+        <w:t>Norman 2013 · Fitts 1954 · ISO 9241-110 · Yablonski 2020 · WCAG 2.2 · Apple HIG · Nielsen 2000 · Nielsen 1994</w:t>
       </w:r>
     </w:p>
     <w:p>
@@ -4636,7 +5522,7 @@
             </w:r>
             <w:r>
               <w:rPr/>
-              <w:t xml:space="preserve"> The same Pedalo unlock step twice: Sam has to remember a code from the previous screen, or the system carries it for him.</w:t>
+              <w:t xml:space="preserve"> The same Pedalo unlock step twice: Sam has to remember a code from the previous screen, or the system carries it for him. A table of findings on memory and load follows.</w:t>
             </w:r>
           </w:p>
         </w:tc>
@@ -5068,6 +5954,319 @@
         <w:spacing w:before="0" w:after="80"/>
       </w:pPr>
     </w:p>
+    <w:p>
+      <w:pPr>
+        <w:spacing w:before="0" w:after="100"/>
+      </w:pPr>
+      <w:r>
+        <w:rPr>
+          <w:b/>
+        </w:rPr>
+        <w:t>Memory and load: findings</w:t>
+      </w:r>
+    </w:p>
+    <w:tbl>
+      <w:tblPr>
+        <w:tblW w:w="9638" w:type="dxa"/>
+        <w:tblBorders>
+          <w:top w:val="single" w:sz="4" w:space="0" w:color="D5DEE9"/>
+          <w:left w:val="single" w:sz="4" w:space="0" w:color="D5DEE9"/>
+          <w:bottom w:val="single" w:sz="4" w:space="0" w:color="D5DEE9"/>
+          <w:right w:val="single" w:sz="4" w:space="0" w:color="D5DEE9"/>
+          <w:insideH w:val="single" w:sz="4" w:space="0" w:color="D5DEE9"/>
+          <w:insideV w:val="single" w:sz="4" w:space="0" w:color="D5DEE9"/>
+        </w:tblBorders>
+        <w:tblLayout w:type="fixed"/>
+        <w:tblCellMar>
+          <w:top w:w="60" w:type="dxa"/>
+          <w:left w:w="100" w:type="dxa"/>
+          <w:bottom w:w="60" w:type="dxa"/>
+          <w:right w:w="100" w:type="dxa"/>
+        </w:tblCellMar>
+      </w:tblPr>
+      <w:tblGrid>
+        <w:gridCol w:w="1911"/>
+        <w:gridCol w:w="4412"/>
+        <w:gridCol w:w="3315"/>
+      </w:tblGrid>
+      <w:tr>
+        <w:trPr>
+          <w:cantSplit/>
+          <w:tblHeader/>
+        </w:trPr>
+        <w:tc>
+          <w:tcPr>
+            <w:tcW w:type="dxa" w:w="1911"/>
+            <w:shd w:val="clear" w:color="auto" w:fill="E6ECF4"/>
+          </w:tcPr>
+          <w:p>
+            <w:pPr>
+              <w:spacing w:before="0" w:after="0"/>
+            </w:pPr>
+            <w:r>
+              <w:rPr>
+                <w:b/>
+                <w:sz w:val="20"/>
+              </w:rPr>
+              <w:t>Finding</w:t>
+            </w:r>
+          </w:p>
+        </w:tc>
+        <w:tc>
+          <w:tcPr>
+            <w:tcW w:type="dxa" w:w="4412"/>
+            <w:shd w:val="clear" w:color="auto" w:fill="E6ECF4"/>
+          </w:tcPr>
+          <w:p>
+            <w:pPr>
+              <w:spacing w:before="0" w:after="0"/>
+            </w:pPr>
+            <w:r>
+              <w:rPr>
+                <w:b/>
+                <w:sz w:val="20"/>
+              </w:rPr>
+              <w:t>What it shows</w:t>
+            </w:r>
+          </w:p>
+        </w:tc>
+        <w:tc>
+          <w:tcPr>
+            <w:tcW w:type="dxa" w:w="3315"/>
+            <w:shd w:val="clear" w:color="auto" w:fill="E6ECF4"/>
+          </w:tcPr>
+          <w:p>
+            <w:pPr>
+              <w:spacing w:before="0" w:after="0"/>
+            </w:pPr>
+            <w:r>
+              <w:rPr>
+                <w:b/>
+                <w:sz w:val="20"/>
+              </w:rPr>
+              <w:t>What it means for a screen</w:t>
+            </w:r>
+          </w:p>
+        </w:tc>
+      </w:tr>
+      <w:tr>
+        <w:trPr>
+          <w:cantSplit/>
+        </w:trPr>
+        <w:tc>
+          <w:tcPr>
+            <w:tcW w:type="dxa" w:w="1911"/>
+          </w:tcPr>
+          <w:p>
+            <w:pPr>
+              <w:spacing w:before="0" w:after="0"/>
+            </w:pPr>
+            <w:r>
+              <w:rPr>
+                <w:sz w:val="20"/>
+              </w:rPr>
+              <w:t>Miller 1956 and Cowan 2001</w:t>
+            </w:r>
+          </w:p>
+        </w:tc>
+        <w:tc>
+          <w:tcPr>
+            <w:tcW w:type="dxa" w:w="4412"/>
+          </w:tcPr>
+          <w:p>
+            <w:pPr>
+              <w:spacing w:before="0" w:after="0"/>
+            </w:pPr>
+            <w:r>
+              <w:rPr>
+                <w:sz w:val="20"/>
+              </w:rPr>
+              <w:t>Miller described a span of about seven chunks; later work puts it nearer four (Miller 1956; Cowan 2001). The number is about chunks, not about menu items.</w:t>
+            </w:r>
+          </w:p>
+        </w:tc>
+        <w:tc>
+          <w:tcPr>
+            <w:tcW w:type="dxa" w:w="3315"/>
+          </w:tcPr>
+          <w:p>
+            <w:pPr>
+              <w:spacing w:before="0" w:after="0"/>
+            </w:pPr>
+            <w:r>
+              <w:rPr>
+                <w:sz w:val="20"/>
+              </w:rPr>
+              <w:t>Do not build a rule on seven; treat memory as small and let the system carry information across steps.</w:t>
+            </w:r>
+          </w:p>
+        </w:tc>
+      </w:tr>
+      <w:tr>
+        <w:trPr>
+          <w:cantSplit/>
+        </w:trPr>
+        <w:tc>
+          <w:tcPr>
+            <w:tcW w:type="dxa" w:w="1911"/>
+          </w:tcPr>
+          <w:p>
+            <w:pPr>
+              <w:spacing w:before="0" w:after="0"/>
+            </w:pPr>
+            <w:r>
+              <w:rPr>
+                <w:sz w:val="20"/>
+              </w:rPr>
+              <w:t>Chunking in practice</w:t>
+            </w:r>
+          </w:p>
+        </w:tc>
+        <w:tc>
+          <w:tcPr>
+            <w:tcW w:type="dxa" w:w="4412"/>
+          </w:tcPr>
+          <w:p>
+            <w:pPr>
+              <w:spacing w:before="0" w:after="0"/>
+            </w:pPr>
+            <w:r>
+              <w:rPr>
+                <w:sz w:val="20"/>
+              </w:rPr>
+              <w:t>An IBAN is written in groups of four characters (ISO 13616), and card numbers are printed in groups of four digits.</w:t>
+            </w:r>
+          </w:p>
+        </w:tc>
+        <w:tc>
+          <w:tcPr>
+            <w:tcW w:type="dxa" w:w="3315"/>
+          </w:tcPr>
+          <w:p>
+            <w:pPr>
+              <w:spacing w:before="0" w:after="0"/>
+            </w:pPr>
+            <w:r>
+              <w:rPr>
+                <w:sz w:val="20"/>
+              </w:rPr>
+              <w:t>Group long codes, so they can be read, remembered and checked in pieces.</w:t>
+            </w:r>
+          </w:p>
+        </w:tc>
+      </w:tr>
+      <w:tr>
+        <w:trPr>
+          <w:cantSplit/>
+        </w:trPr>
+        <w:tc>
+          <w:tcPr>
+            <w:tcW w:type="dxa" w:w="1911"/>
+          </w:tcPr>
+          <w:p>
+            <w:pPr>
+              <w:spacing w:before="0" w:after="0"/>
+            </w:pPr>
+            <w:r>
+              <w:rPr>
+                <w:sz w:val="20"/>
+              </w:rPr>
+              <w:t>Load and abandonment</w:t>
+            </w:r>
+          </w:p>
+        </w:tc>
+        <w:tc>
+          <w:tcPr>
+            <w:tcW w:type="dxa" w:w="4412"/>
+          </w:tcPr>
+          <w:p>
+            <w:pPr>
+              <w:spacing w:before="0" w:after="0"/>
+            </w:pPr>
+            <w:r>
+              <w:rPr>
+                <w:sz w:val="20"/>
+              </w:rPr>
+              <w:t>17% of the US online shoppers had abandoned an order in the past quarter because the checkout seemed too long or complicated (Baymard Institute 2024).</w:t>
+            </w:r>
+          </w:p>
+        </w:tc>
+        <w:tc>
+          <w:tcPr>
+            <w:tcW w:type="dxa" w:w="3315"/>
+          </w:tcPr>
+          <w:p>
+            <w:pPr>
+              <w:spacing w:before="0" w:after="0"/>
+            </w:pPr>
+            <w:r>
+              <w:rPr>
+                <w:sz w:val="20"/>
+              </w:rPr>
+              <w:t>Count what a step asks people to remember and to compare, and remove it.</w:t>
+            </w:r>
+          </w:p>
+        </w:tc>
+      </w:tr>
+      <w:tr>
+        <w:trPr>
+          <w:cantSplit/>
+        </w:trPr>
+        <w:tc>
+          <w:tcPr>
+            <w:tcW w:type="dxa" w:w="1911"/>
+          </w:tcPr>
+          <w:p>
+            <w:pPr>
+              <w:spacing w:before="0" w:after="0"/>
+            </w:pPr>
+            <w:r>
+              <w:rPr>
+                <w:sz w:val="20"/>
+              </w:rPr>
+              <w:t>Extraneous load</w:t>
+            </w:r>
+          </w:p>
+        </w:tc>
+        <w:tc>
+          <w:tcPr>
+            <w:tcW w:type="dxa" w:w="4412"/>
+          </w:tcPr>
+          <w:p>
+            <w:pPr>
+              <w:spacing w:before="0" w:after="0"/>
+            </w:pPr>
+            <w:r>
+              <w:rPr>
+                <w:sz w:val="20"/>
+              </w:rPr>
+              <w:t>Effort spent on working out the interface is missing for the task (Sweller 1988).</w:t>
+            </w:r>
+          </w:p>
+        </w:tc>
+        <w:tc>
+          <w:tcPr>
+            <w:tcW w:type="dxa" w:w="3315"/>
+          </w:tcPr>
+          <w:p>
+            <w:pPr>
+              <w:spacing w:before="0" w:after="0"/>
+            </w:pPr>
+            <w:r>
+              <w:rPr>
+                <w:sz w:val="20"/>
+              </w:rPr>
+              <w:t>Remove the effort that does not serve the task before adding any help.</w:t>
+            </w:r>
+          </w:p>
+        </w:tc>
+      </w:tr>
+    </w:tbl>
+    <w:p>
+      <w:pPr>
+        <w:spacing w:before="0" w:after="80"/>
+      </w:pPr>
+    </w:p>
     <w:tbl>
       <w:tblPr>
         <w:tblW w:w="9598" w:type="dxa"/>
@@ -5117,7 +6316,7 @@
             </w:pPr>
             <w:r>
               <w:rPr/>
-              <w:t>Pedalo, Nina, Sam, Yusuf and Clara are made up for this example. The limits of short-term memory follow Miller (1956) and Cowan (2001); cognitive load follows Sweller (1988); recognition rather than recall is Nielsen's heuristic (1994).</w:t>
+              <w:t>Pedalo, Nina, Sam, Yusuf and Clara are made up for this example. The limits of short-term memory follow Miller (1956) and Cowan (2001); cognitive load follows Sweller (1988); recognition rather than recall is Nielsen's heuristic (1994). The findings in the table of real evidence are real research results, rules and cases; the sources are listed below.</w:t>
             </w:r>
           </w:p>
         </w:tc>
@@ -5296,7 +6495,7 @@
           <w:color w:val="556274"/>
           <w:sz w:val="18"/>
         </w:rPr>
-        <w:t>Miller 1956 · Cowan 2001 · Sweller 1988 · Nielsen 1994</w:t>
+        <w:t>Miller 1956 · Cowan 2001 · Sweller 1988 · Nielsen 1994 · Baymard Institute 2024 · ISO 13616</w:t>
       </w:r>
     </w:p>
     <w:p>
@@ -5305,7 +6504,7 @@
       </w:pPr>
       <w:r>
         <w:rPr/>
-        <w:t>A5 · UX laws as tools against friction, and weighing a measure · 12 min · Core</w:t>
+        <w:t>A5 · UX laws as tools against friction, and weighing a measure · 11 min · Core</w:t>
       </w:r>
     </w:p>
     <w:p>
@@ -5410,7 +6609,7 @@
             </w:r>
             <w:r>
               <w:rPr/>
-              <w:t xml:space="preserve"> Three measures Pedalo considered, rated on effect on users, feasibility, risk and time pressure. A rating is a reading of the example, not a mark.</w:t>
+              <w:t xml:space="preserve"> Three measures Pedalo considered, rated on effect on users, feasibility, risk and time pressure. A rating is a reading of the example, not a mark. A table on the laws of UX and where they stop follows.</w:t>
             </w:r>
           </w:p>
         </w:tc>
@@ -5789,6 +6988,372 @@
         <w:spacing w:before="0" w:after="80"/>
       </w:pPr>
     </w:p>
+    <w:p>
+      <w:pPr>
+        <w:spacing w:before="0" w:after="100"/>
+      </w:pPr>
+      <w:r>
+        <w:rPr>
+          <w:b/>
+        </w:rPr>
+        <w:t>The laws of UX as tools, and where they stop</w:t>
+      </w:r>
+    </w:p>
+    <w:tbl>
+      <w:tblPr>
+        <w:tblW w:w="9638" w:type="dxa"/>
+        <w:tblBorders>
+          <w:top w:val="single" w:sz="4" w:space="0" w:color="D5DEE9"/>
+          <w:left w:val="single" w:sz="4" w:space="0" w:color="D5DEE9"/>
+          <w:bottom w:val="single" w:sz="4" w:space="0" w:color="D5DEE9"/>
+          <w:right w:val="single" w:sz="4" w:space="0" w:color="D5DEE9"/>
+          <w:insideH w:val="single" w:sz="4" w:space="0" w:color="D5DEE9"/>
+          <w:insideV w:val="single" w:sz="4" w:space="0" w:color="D5DEE9"/>
+        </w:tblBorders>
+        <w:tblLayout w:type="fixed"/>
+        <w:tblCellMar>
+          <w:top w:w="60" w:type="dxa"/>
+          <w:left w:w="100" w:type="dxa"/>
+          <w:bottom w:w="60" w:type="dxa"/>
+          <w:right w:w="100" w:type="dxa"/>
+        </w:tblCellMar>
+      </w:tblPr>
+      <w:tblGrid>
+        <w:gridCol w:w="1672"/>
+        <w:gridCol w:w="3273"/>
+        <w:gridCol w:w="4693"/>
+      </w:tblGrid>
+      <w:tr>
+        <w:trPr>
+          <w:cantSplit/>
+          <w:tblHeader/>
+        </w:trPr>
+        <w:tc>
+          <w:tcPr>
+            <w:tcW w:type="dxa" w:w="1672"/>
+            <w:shd w:val="clear" w:color="auto" w:fill="E6ECF4"/>
+          </w:tcPr>
+          <w:p>
+            <w:pPr>
+              <w:spacing w:before="0" w:after="0"/>
+            </w:pPr>
+            <w:r>
+              <w:rPr>
+                <w:b/>
+                <w:sz w:val="20"/>
+              </w:rPr>
+              <w:t>Law</w:t>
+            </w:r>
+          </w:p>
+        </w:tc>
+        <w:tc>
+          <w:tcPr>
+            <w:tcW w:type="dxa" w:w="3273"/>
+            <w:shd w:val="clear" w:color="auto" w:fill="E6ECF4"/>
+          </w:tcPr>
+          <w:p>
+            <w:pPr>
+              <w:spacing w:before="0" w:after="0"/>
+            </w:pPr>
+            <w:r>
+              <w:rPr>
+                <w:b/>
+                <w:sz w:val="20"/>
+              </w:rPr>
+              <w:t>What it is good for</w:t>
+            </w:r>
+          </w:p>
+        </w:tc>
+        <w:tc>
+          <w:tcPr>
+            <w:tcW w:type="dxa" w:w="4693"/>
+            <w:shd w:val="clear" w:color="auto" w:fill="E6ECF4"/>
+          </w:tcPr>
+          <w:p>
+            <w:pPr>
+              <w:spacing w:before="0" w:after="0"/>
+            </w:pPr>
+            <w:r>
+              <w:rPr>
+                <w:b/>
+                <w:sz w:val="20"/>
+              </w:rPr>
+              <w:t>Where it stops</w:t>
+            </w:r>
+          </w:p>
+        </w:tc>
+      </w:tr>
+      <w:tr>
+        <w:trPr>
+          <w:cantSplit/>
+        </w:trPr>
+        <w:tc>
+          <w:tcPr>
+            <w:tcW w:type="dxa" w:w="1672"/>
+          </w:tcPr>
+          <w:p>
+            <w:pPr>
+              <w:spacing w:before="0" w:after="0"/>
+            </w:pPr>
+            <w:r>
+              <w:rPr>
+                <w:sz w:val="20"/>
+              </w:rPr>
+              <w:t>Hick's law</w:t>
+            </w:r>
+          </w:p>
+        </w:tc>
+        <w:tc>
+          <w:tcPr>
+            <w:tcW w:type="dxa" w:w="3273"/>
+          </w:tcPr>
+          <w:p>
+            <w:pPr>
+              <w:spacing w:before="0" w:after="0"/>
+            </w:pPr>
+            <w:r>
+              <w:rPr>
+                <w:sz w:val="20"/>
+              </w:rPr>
+              <w:t>Ordering and grouping options: frequent ones first, the rest grouped.</w:t>
+            </w:r>
+          </w:p>
+        </w:tc>
+        <w:tc>
+          <w:tcPr>
+            <w:tcW w:type="dxa" w:w="4693"/>
+          </w:tcPr>
+          <w:p>
+            <w:pPr>
+              <w:spacing w:before="0" w:after="0"/>
+            </w:pPr>
+            <w:r>
+              <w:rPr>
+                <w:sz w:val="20"/>
+              </w:rPr>
+              <w:t>It is about equally likely, unfamiliar options; it does not say that fewer is always better (Larson and Czerwinski 1998).</w:t>
+            </w:r>
+          </w:p>
+        </w:tc>
+      </w:tr>
+      <w:tr>
+        <w:trPr>
+          <w:cantSplit/>
+        </w:trPr>
+        <w:tc>
+          <w:tcPr>
+            <w:tcW w:type="dxa" w:w="1672"/>
+          </w:tcPr>
+          <w:p>
+            <w:pPr>
+              <w:spacing w:before="0" w:after="0"/>
+            </w:pPr>
+            <w:r>
+              <w:rPr>
+                <w:sz w:val="20"/>
+              </w:rPr>
+              <w:t>Fitts's law</w:t>
+            </w:r>
+          </w:p>
+        </w:tc>
+        <w:tc>
+          <w:tcPr>
+            <w:tcW w:type="dxa" w:w="3273"/>
+          </w:tcPr>
+          <w:p>
+            <w:pPr>
+              <w:spacing w:before="0" w:after="0"/>
+            </w:pPr>
+            <w:r>
+              <w:rPr>
+                <w:sz w:val="20"/>
+              </w:rPr>
+              <w:t>Sizing and placing targets.</w:t>
+            </w:r>
+          </w:p>
+        </w:tc>
+        <w:tc>
+          <w:tcPr>
+            <w:tcW w:type="dxa" w:w="4693"/>
+          </w:tcPr>
+          <w:p>
+            <w:pPr>
+              <w:spacing w:before="0" w:after="0"/>
+            </w:pPr>
+            <w:r>
+              <w:rPr>
+                <w:sz w:val="20"/>
+              </w:rPr>
+              <w:t>It models pointing; on touch screens thumb reach and accidental taps matter as well (WCAG 2.5.8).</w:t>
+            </w:r>
+          </w:p>
+        </w:tc>
+      </w:tr>
+      <w:tr>
+        <w:trPr>
+          <w:cantSplit/>
+        </w:trPr>
+        <w:tc>
+          <w:tcPr>
+            <w:tcW w:type="dxa" w:w="1672"/>
+          </w:tcPr>
+          <w:p>
+            <w:pPr>
+              <w:spacing w:before="0" w:after="0"/>
+            </w:pPr>
+            <w:r>
+              <w:rPr>
+                <w:sz w:val="20"/>
+              </w:rPr>
+              <w:t>Miller's rule</w:t>
+            </w:r>
+          </w:p>
+        </w:tc>
+        <w:tc>
+          <w:tcPr>
+            <w:tcW w:type="dxa" w:w="3273"/>
+          </w:tcPr>
+          <w:p>
+            <w:pPr>
+              <w:spacing w:before="0" w:after="0"/>
+            </w:pPr>
+            <w:r>
+              <w:rPr>
+                <w:sz w:val="20"/>
+              </w:rPr>
+              <w:t>Reminding that memory is small.</w:t>
+            </w:r>
+          </w:p>
+        </w:tc>
+        <w:tc>
+          <w:tcPr>
+            <w:tcW w:type="dxa" w:w="4693"/>
+          </w:tcPr>
+          <w:p>
+            <w:pPr>
+              <w:spacing w:before="0" w:after="0"/>
+            </w:pPr>
+            <w:r>
+              <w:rPr>
+                <w:sz w:val="20"/>
+              </w:rPr>
+              <w:t>Seven is not a limit for menus; the span is about chunks and is nearer four (Cowan 2001).</w:t>
+            </w:r>
+          </w:p>
+        </w:tc>
+      </w:tr>
+      <w:tr>
+        <w:trPr>
+          <w:cantSplit/>
+        </w:trPr>
+        <w:tc>
+          <w:tcPr>
+            <w:tcW w:type="dxa" w:w="1672"/>
+          </w:tcPr>
+          <w:p>
+            <w:pPr>
+              <w:spacing w:before="0" w:after="0"/>
+            </w:pPr>
+            <w:r>
+              <w:rPr>
+                <w:sz w:val="20"/>
+              </w:rPr>
+              <w:t>Jakob's law</w:t>
+            </w:r>
+          </w:p>
+        </w:tc>
+        <w:tc>
+          <w:tcPr>
+            <w:tcW w:type="dxa" w:w="3273"/>
+          </w:tcPr>
+          <w:p>
+            <w:pPr>
+              <w:spacing w:before="0" w:after="0"/>
+            </w:pPr>
+            <w:r>
+              <w:rPr>
+                <w:sz w:val="20"/>
+              </w:rPr>
+              <w:t>Choosing familiar patterns.</w:t>
+            </w:r>
+          </w:p>
+        </w:tc>
+        <w:tc>
+          <w:tcPr>
+            <w:tcW w:type="dxa" w:w="4693"/>
+          </w:tcPr>
+          <w:p>
+            <w:pPr>
+              <w:spacing w:before="0" w:after="0"/>
+            </w:pPr>
+            <w:r>
+              <w:rPr>
+                <w:sz w:val="20"/>
+              </w:rPr>
+              <w:t>Familiar is not always best: a new pattern can pay if it removes real friction.</w:t>
+            </w:r>
+          </w:p>
+        </w:tc>
+      </w:tr>
+      <w:tr>
+        <w:trPr>
+          <w:cantSplit/>
+        </w:trPr>
+        <w:tc>
+          <w:tcPr>
+            <w:tcW w:type="dxa" w:w="1672"/>
+          </w:tcPr>
+          <w:p>
+            <w:pPr>
+              <w:spacing w:before="0" w:after="0"/>
+            </w:pPr>
+            <w:r>
+              <w:rPr>
+                <w:sz w:val="20"/>
+              </w:rPr>
+              <w:t>A real step reduction</w:t>
+            </w:r>
+          </w:p>
+        </w:tc>
+        <w:tc>
+          <w:tcPr>
+            <w:tcW w:type="dxa" w:w="3273"/>
+          </w:tcPr>
+          <w:p>
+            <w:pPr>
+              <w:spacing w:before="0" w:after="0"/>
+            </w:pPr>
+            <w:r>
+              <w:rPr>
+                <w:sz w:val="20"/>
+              </w:rPr>
+              <w:t>Amazon's patent for one-click ordering (US 5,960,411, granted 1999) describes a purchase in one action by reusing stored data.</w:t>
+            </w:r>
+          </w:p>
+        </w:tc>
+        <w:tc>
+          <w:tcPr>
+            <w:tcW w:type="dxa" w:w="4693"/>
+          </w:tcPr>
+          <w:p>
+            <w:pPr>
+              <w:spacing w:before="0" w:after="0"/>
+            </w:pPr>
+            <w:r>
+              <w:rPr>
+                <w:sz w:val="20"/>
+              </w:rPr>
+              <w:t>The saving came from carrying information for the user, not from a smaller screen.</w:t>
+            </w:r>
+          </w:p>
+        </w:tc>
+      </w:tr>
+    </w:tbl>
+    <w:p>
+      <w:pPr>
+        <w:spacing w:before="0" w:after="80"/>
+      </w:pPr>
+    </w:p>
     <w:tbl>
       <w:tblPr>
         <w:tblW w:w="9598" w:type="dxa"/>
@@ -5838,7 +7403,7 @@
             </w:pPr>
             <w:r>
               <w:rPr/>
-              <w:t>Pedalo, Nina, Sam, Yusuf and Clara are made up for this example. The laws as practical tools follow Yablonski (2020); rating options on the same criteria with a reason follows Gibbons (2018). The four criteria are the ones the plan names for the case study.</w:t>
+              <w:t>Pedalo, Nina, Sam, Yusuf and Clara are made up for this example. The laws as practical tools follow Yablonski (2020); rating options on the same criteria with a reason follows Gibbons (2018). The four criteria are the ones the plan names for the case study. The findings in the table of real evidence are real research results, rules and cases; the sources are listed below.</w:t>
             </w:r>
           </w:p>
         </w:tc>
@@ -6027,7 +7592,7 @@
           <w:color w:val="556274"/>
           <w:sz w:val="18"/>
         </w:rPr>
-        <w:t>Yablonski 2020 · Gibbons 2018 · Nielsen 1994</w:t>
+        <w:t>Yablonski 2020 · Gibbons 2018 · Nielsen 1994 · US 5,960,411 · WCAG 2.2 · Cowan 2001</w:t>
       </w:r>
     </w:p>
     <w:p>
@@ -6213,7 +7778,7 @@
             </w:r>
             <w:r>
               <w:rPr/>
-              <w:t xml:space="preserve"> Left Pedalo answering problems with new functions, right reducing friction first. Below, the chain from a screen to the whole product system.</w:t>
+              <w:t xml:space="preserve"> Left Pedalo answering problems with new functions, right reducing friction first. Below, the chain from a screen to the whole product system. A table of evidence follows.</w:t>
             </w:r>
           </w:p>
         </w:tc>
@@ -6334,6 +7899,266 @@
         <w:t>Figure 8 · From one screen to the whole product system.</w:t>
       </w:r>
     </w:p>
+    <w:p>
+      <w:pPr>
+        <w:spacing w:before="0" w:after="100"/>
+      </w:pPr>
+      <w:r>
+        <w:rPr>
+          <w:b/>
+        </w:rPr>
+        <w:t>Usability as a strategic factor: evidence</w:t>
+      </w:r>
+    </w:p>
+    <w:tbl>
+      <w:tblPr>
+        <w:tblW w:w="9638" w:type="dxa"/>
+        <w:tblBorders>
+          <w:top w:val="single" w:sz="4" w:space="0" w:color="D5DEE9"/>
+          <w:left w:val="single" w:sz="4" w:space="0" w:color="D5DEE9"/>
+          <w:bottom w:val="single" w:sz="4" w:space="0" w:color="D5DEE9"/>
+          <w:right w:val="single" w:sz="4" w:space="0" w:color="D5DEE9"/>
+          <w:insideH w:val="single" w:sz="4" w:space="0" w:color="D5DEE9"/>
+          <w:insideV w:val="single" w:sz="4" w:space="0" w:color="D5DEE9"/>
+        </w:tblBorders>
+        <w:tblLayout w:type="fixed"/>
+        <w:tblCellMar>
+          <w:top w:w="60" w:type="dxa"/>
+          <w:left w:w="100" w:type="dxa"/>
+          <w:bottom w:w="60" w:type="dxa"/>
+          <w:right w:w="100" w:type="dxa"/>
+        </w:tblCellMar>
+      </w:tblPr>
+      <w:tblGrid>
+        <w:gridCol w:w="1964"/>
+        <w:gridCol w:w="3853"/>
+        <w:gridCol w:w="3821"/>
+      </w:tblGrid>
+      <w:tr>
+        <w:trPr>
+          <w:cantSplit/>
+          <w:tblHeader/>
+        </w:trPr>
+        <w:tc>
+          <w:tcPr>
+            <w:tcW w:type="dxa" w:w="1964"/>
+            <w:shd w:val="clear" w:color="auto" w:fill="E6ECF4"/>
+          </w:tcPr>
+          <w:p>
+            <w:pPr>
+              <w:spacing w:before="0" w:after="0"/>
+            </w:pPr>
+            <w:r>
+              <w:rPr>
+                <w:b/>
+                <w:sz w:val="20"/>
+              </w:rPr>
+              <w:t>Evidence</w:t>
+            </w:r>
+          </w:p>
+        </w:tc>
+        <w:tc>
+          <w:tcPr>
+            <w:tcW w:type="dxa" w:w="3853"/>
+            <w:shd w:val="clear" w:color="auto" w:fill="E6ECF4"/>
+          </w:tcPr>
+          <w:p>
+            <w:pPr>
+              <w:spacing w:before="0" w:after="0"/>
+            </w:pPr>
+            <w:r>
+              <w:rPr>
+                <w:b/>
+                <w:sz w:val="20"/>
+              </w:rPr>
+              <w:t>What it shows</w:t>
+            </w:r>
+          </w:p>
+        </w:tc>
+        <w:tc>
+          <w:tcPr>
+            <w:tcW w:type="dxa" w:w="3821"/>
+            <w:shd w:val="clear" w:color="auto" w:fill="E6ECF4"/>
+          </w:tcPr>
+          <w:p>
+            <w:pPr>
+              <w:spacing w:before="0" w:after="0"/>
+            </w:pPr>
+            <w:r>
+              <w:rPr>
+                <w:b/>
+                <w:sz w:val="20"/>
+              </w:rPr>
+              <w:t>What it means for a decision</w:t>
+            </w:r>
+          </w:p>
+        </w:tc>
+      </w:tr>
+      <w:tr>
+        <w:trPr>
+          <w:cantSplit/>
+        </w:trPr>
+        <w:tc>
+          <w:tcPr>
+            <w:tcW w:type="dxa" w:w="1964"/>
+          </w:tcPr>
+          <w:p>
+            <w:pPr>
+              <w:spacing w:before="0" w:after="0"/>
+            </w:pPr>
+            <w:r>
+              <w:rPr>
+                <w:sz w:val="20"/>
+              </w:rPr>
+              <w:t>Baymard Institute 2024</w:t>
+            </w:r>
+          </w:p>
+        </w:tc>
+        <w:tc>
+          <w:tcPr>
+            <w:tcW w:type="dxa" w:w="3853"/>
+          </w:tcPr>
+          <w:p>
+            <w:pPr>
+              <w:spacing w:before="0" w:after="0"/>
+            </w:pPr>
+            <w:r>
+              <w:rPr>
+                <w:sz w:val="20"/>
+              </w:rPr>
+              <w:t>17% of the US online shoppers abandoned an order in the past quarter because of a long or complicated checkout.</w:t>
+            </w:r>
+          </w:p>
+        </w:tc>
+        <w:tc>
+          <w:tcPr>
+            <w:tcW w:type="dxa" w:w="3821"/>
+          </w:tcPr>
+          <w:p>
+            <w:pPr>
+              <w:spacing w:before="0" w:after="0"/>
+            </w:pPr>
+            <w:r>
+              <w:rPr>
+                <w:sz w:val="20"/>
+              </w:rPr>
+              <w:t>Friction is a business figure: it shows in completions.</w:t>
+            </w:r>
+          </w:p>
+        </w:tc>
+      </w:tr>
+      <w:tr>
+        <w:trPr>
+          <w:cantSplit/>
+        </w:trPr>
+        <w:tc>
+          <w:tcPr>
+            <w:tcW w:type="dxa" w:w="1964"/>
+          </w:tcPr>
+          <w:p>
+            <w:pPr>
+              <w:spacing w:before="0" w:after="0"/>
+            </w:pPr>
+            <w:r>
+              <w:rPr>
+                <w:sz w:val="20"/>
+              </w:rPr>
+              <w:t>Larson and Czerwinski 1998</w:t>
+            </w:r>
+          </w:p>
+        </w:tc>
+        <w:tc>
+          <w:tcPr>
+            <w:tcW w:type="dxa" w:w="3853"/>
+          </w:tcPr>
+          <w:p>
+            <w:pPr>
+              <w:spacing w:before="0" w:after="0"/>
+            </w:pPr>
+            <w:r>
+              <w:rPr>
+                <w:sz w:val="20"/>
+              </w:rPr>
+              <w:t>How content is structured changes how fast people find it, independent of the content.</w:t>
+            </w:r>
+          </w:p>
+        </w:tc>
+        <w:tc>
+          <w:tcPr>
+            <w:tcW w:type="dxa" w:w="3821"/>
+          </w:tcPr>
+          <w:p>
+            <w:pPr>
+              <w:spacing w:before="0" w:after="0"/>
+            </w:pPr>
+            <w:r>
+              <w:rPr>
+                <w:sz w:val="20"/>
+              </w:rPr>
+              <w:t>Structure is a decision with a measurable effect, not a layout detail.</w:t>
+            </w:r>
+          </w:p>
+        </w:tc>
+      </w:tr>
+      <w:tr>
+        <w:trPr>
+          <w:cantSplit/>
+        </w:trPr>
+        <w:tc>
+          <w:tcPr>
+            <w:tcW w:type="dxa" w:w="1964"/>
+          </w:tcPr>
+          <w:p>
+            <w:pPr>
+              <w:spacing w:before="0" w:after="0"/>
+            </w:pPr>
+            <w:r>
+              <w:rPr>
+                <w:sz w:val="20"/>
+              </w:rPr>
+              <w:t>Raskin 1994</w:t>
+            </w:r>
+          </w:p>
+        </w:tc>
+        <w:tc>
+          <w:tcPr>
+            <w:tcW w:type="dxa" w:w="3853"/>
+          </w:tcPr>
+          <w:p>
+            <w:pPr>
+              <w:spacing w:before="0" w:after="0"/>
+            </w:pPr>
+            <w:r>
+              <w:rPr>
+                <w:sz w:val="20"/>
+              </w:rPr>
+              <w:t>Intuitive means familiar.</w:t>
+            </w:r>
+          </w:p>
+        </w:tc>
+        <w:tc>
+          <w:tcPr>
+            <w:tcW w:type="dxa" w:w="3821"/>
+          </w:tcPr>
+          <w:p>
+            <w:pPr>
+              <w:spacing w:before="0" w:after="0"/>
+            </w:pPr>
+            <w:r>
+              <w:rPr>
+                <w:sz w:val="20"/>
+              </w:rPr>
+              <w:t>A strategy for ease of use starts from what users already know, across all channels.</w:t>
+            </w:r>
+          </w:p>
+        </w:tc>
+      </w:tr>
+    </w:tbl>
+    <w:p>
+      <w:pPr>
+        <w:spacing w:before="0" w:after="80"/>
+      </w:pPr>
+    </w:p>
     <w:tbl>
       <w:tblPr>
         <w:tblW w:w="9598" w:type="dxa"/>
@@ -6383,7 +8208,7 @@
             </w:pPr>
             <w:r>
               <w:rPr/>
-              <w:t>Pedalo, Nina, Sam, Yusuf and Clara are made up for this example. Designing for how people act follows Norman (2013); the interaction principles follow ISO 9241-110.</w:t>
+              <w:t>Pedalo, Nina, Sam, Yusuf and Clara are made up for this example. Designing for how people act follows Norman (2013); the interaction principles follow ISO 9241-110. The findings in the table of real evidence are real research results, rules and cases; the sources are listed below.</w:t>
             </w:r>
           </w:p>
         </w:tc>
@@ -6562,7 +8387,7 @@
           <w:color w:val="556274"/>
           <w:sz w:val="18"/>
         </w:rPr>
-        <w:t>Norman 2013 · ISO 9241-110 · Yablonski 2020</w:t>
+        <w:t>Norman 2013 · ISO 9241-110 · Yablonski 2020 · Baymard Institute 2024 · Larson &amp; Czerwinski 1998 · Raskin 1994</w:t>
       </w:r>
     </w:p>
     <w:p>
@@ -6676,7 +8501,7 @@
             </w:r>
             <w:r>
               <w:rPr/>
-              <w:t xml:space="preserve"> The matrix places five Pedalo designs by how many functions they show at once (to the right) and how easily riders finish their task (upwards). A position is a reading of the example, not a score.</w:t>
+              <w:t xml:space="preserve"> The matrix places five Pedalo designs by how many functions they show at once (to the right) and how easily riders finish their task (upwards). A position is a reading of the example, not a score. A table of conflicts with evidence follows.</w:t>
             </w:r>
           </w:p>
         </w:tc>
@@ -7002,6 +8827,266 @@
         <w:spacing w:before="0" w:after="80"/>
       </w:pPr>
     </w:p>
+    <w:p>
+      <w:pPr>
+        <w:spacing w:before="0" w:after="100"/>
+      </w:pPr>
+      <w:r>
+        <w:rPr>
+          <w:b/>
+        </w:rPr>
+        <w:t>Conflicts of intuitive use, with evidence</w:t>
+      </w:r>
+    </w:p>
+    <w:tbl>
+      <w:tblPr>
+        <w:tblW w:w="9638" w:type="dxa"/>
+        <w:tblBorders>
+          <w:top w:val="single" w:sz="4" w:space="0" w:color="D5DEE9"/>
+          <w:left w:val="single" w:sz="4" w:space="0" w:color="D5DEE9"/>
+          <w:bottom w:val="single" w:sz="4" w:space="0" w:color="D5DEE9"/>
+          <w:right w:val="single" w:sz="4" w:space="0" w:color="D5DEE9"/>
+          <w:insideH w:val="single" w:sz="4" w:space="0" w:color="D5DEE9"/>
+          <w:insideV w:val="single" w:sz="4" w:space="0" w:color="D5DEE9"/>
+        </w:tblBorders>
+        <w:tblLayout w:type="fixed"/>
+        <w:tblCellMar>
+          <w:top w:w="60" w:type="dxa"/>
+          <w:left w:w="100" w:type="dxa"/>
+          <w:bottom w:w="60" w:type="dxa"/>
+          <w:right w:w="100" w:type="dxa"/>
+        </w:tblCellMar>
+      </w:tblPr>
+      <w:tblGrid>
+        <w:gridCol w:w="2337"/>
+        <w:gridCol w:w="4342"/>
+        <w:gridCol w:w="2959"/>
+      </w:tblGrid>
+      <w:tr>
+        <w:trPr>
+          <w:cantSplit/>
+          <w:tblHeader/>
+        </w:trPr>
+        <w:tc>
+          <w:tcPr>
+            <w:tcW w:type="dxa" w:w="2337"/>
+            <w:shd w:val="clear" w:color="auto" w:fill="E6ECF4"/>
+          </w:tcPr>
+          <w:p>
+            <w:pPr>
+              <w:spacing w:before="0" w:after="0"/>
+            </w:pPr>
+            <w:r>
+              <w:rPr>
+                <w:b/>
+                <w:sz w:val="20"/>
+              </w:rPr>
+              <w:t>Conflict</w:t>
+            </w:r>
+          </w:p>
+        </w:tc>
+        <w:tc>
+          <w:tcPr>
+            <w:tcW w:type="dxa" w:w="4342"/>
+            <w:shd w:val="clear" w:color="auto" w:fill="E6ECF4"/>
+          </w:tcPr>
+          <w:p>
+            <w:pPr>
+              <w:spacing w:before="0" w:after="0"/>
+            </w:pPr>
+            <w:r>
+              <w:rPr>
+                <w:b/>
+                <w:sz w:val="20"/>
+              </w:rPr>
+              <w:t>What the evidence says</w:t>
+            </w:r>
+          </w:p>
+        </w:tc>
+        <w:tc>
+          <w:tcPr>
+            <w:tcW w:type="dxa" w:w="2959"/>
+            <w:shd w:val="clear" w:color="auto" w:fill="E6ECF4"/>
+          </w:tcPr>
+          <w:p>
+            <w:pPr>
+              <w:spacing w:before="0" w:after="0"/>
+            </w:pPr>
+            <w:r>
+              <w:rPr>
+                <w:b/>
+                <w:sz w:val="20"/>
+              </w:rPr>
+              <w:t>A way to decide</w:t>
+            </w:r>
+          </w:p>
+        </w:tc>
+      </w:tr>
+      <w:tr>
+        <w:trPr>
+          <w:cantSplit/>
+        </w:trPr>
+        <w:tc>
+          <w:tcPr>
+            <w:tcW w:type="dxa" w:w="2337"/>
+          </w:tcPr>
+          <w:p>
+            <w:pPr>
+              <w:spacing w:before="0" w:after="0"/>
+            </w:pPr>
+            <w:r>
+              <w:rPr>
+                <w:sz w:val="20"/>
+              </w:rPr>
+              <w:t>Scope of functions against simplicity</w:t>
+            </w:r>
+          </w:p>
+        </w:tc>
+        <w:tc>
+          <w:tcPr>
+            <w:tcW w:type="dxa" w:w="4342"/>
+          </w:tcPr>
+          <w:p>
+            <w:pPr>
+              <w:spacing w:before="0" w:after="0"/>
+            </w:pPr>
+            <w:r>
+              <w:rPr>
+                <w:sz w:val="20"/>
+              </w:rPr>
+              <w:t>More choice can mean fewer decisions (Iyengar and Lepper 2000), and a medium structure beats the broadest one (Larson and Czerwinski 1998).</w:t>
+            </w:r>
+          </w:p>
+        </w:tc>
+        <w:tc>
+          <w:tcPr>
+            <w:tcW w:type="dxa" w:w="2959"/>
+          </w:tcPr>
+          <w:p>
+            <w:pPr>
+              <w:spacing w:before="0" w:after="0"/>
+            </w:pPr>
+            <w:r>
+              <w:rPr>
+                <w:sz w:val="20"/>
+              </w:rPr>
+              <w:t>Put the frequent tasks first and group the rest in few levels.</w:t>
+            </w:r>
+          </w:p>
+        </w:tc>
+      </w:tr>
+      <w:tr>
+        <w:trPr>
+          <w:cantSplit/>
+        </w:trPr>
+        <w:tc>
+          <w:tcPr>
+            <w:tcW w:type="dxa" w:w="2337"/>
+          </w:tcPr>
+          <w:p>
+            <w:pPr>
+              <w:spacing w:before="0" w:after="0"/>
+            </w:pPr>
+            <w:r>
+              <w:rPr>
+                <w:sz w:val="20"/>
+              </w:rPr>
+              <w:t>New against experienced users</w:t>
+            </w:r>
+          </w:p>
+        </w:tc>
+        <w:tc>
+          <w:tcPr>
+            <w:tcW w:type="dxa" w:w="4342"/>
+          </w:tcPr>
+          <w:p>
+            <w:pPr>
+              <w:spacing w:before="0" w:after="0"/>
+            </w:pPr>
+            <w:r>
+              <w:rPr>
+                <w:sz w:val="20"/>
+              </w:rPr>
+              <w:t>Users expect a product to work like the others they know (Nielsen 2000).</w:t>
+            </w:r>
+          </w:p>
+        </w:tc>
+        <w:tc>
+          <w:tcPr>
+            <w:tcW w:type="dxa" w:w="2959"/>
+          </w:tcPr>
+          <w:p>
+            <w:pPr>
+              <w:spacing w:before="0" w:after="0"/>
+            </w:pPr>
+            <w:r>
+              <w:rPr>
+                <w:sz w:val="20"/>
+              </w:rPr>
+              <w:t>Keep the main pattern familiar and add shortcuts for experts.</w:t>
+            </w:r>
+          </w:p>
+        </w:tc>
+      </w:tr>
+      <w:tr>
+        <w:trPr>
+          <w:cantSplit/>
+        </w:trPr>
+        <w:tc>
+          <w:tcPr>
+            <w:tcW w:type="dxa" w:w="2337"/>
+          </w:tcPr>
+          <w:p>
+            <w:pPr>
+              <w:spacing w:before="0" w:after="0"/>
+            </w:pPr>
+            <w:r>
+              <w:rPr>
+                <w:sz w:val="20"/>
+              </w:rPr>
+              <w:t>The ideal against time</w:t>
+            </w:r>
+          </w:p>
+        </w:tc>
+        <w:tc>
+          <w:tcPr>
+            <w:tcW w:type="dxa" w:w="4342"/>
+          </w:tcPr>
+          <w:p>
+            <w:pPr>
+              <w:spacing w:before="0" w:after="0"/>
+            </w:pPr>
+            <w:r>
+              <w:rPr>
+                <w:sz w:val="20"/>
+              </w:rPr>
+              <w:t>Abandonment through a long checkout is common (Baymard Institute 2024).</w:t>
+            </w:r>
+          </w:p>
+        </w:tc>
+        <w:tc>
+          <w:tcPr>
+            <w:tcW w:type="dxa" w:w="2959"/>
+          </w:tcPr>
+          <w:p>
+            <w:pPr>
+              <w:spacing w:before="0" w:after="0"/>
+            </w:pPr>
+            <w:r>
+              <w:rPr>
+                <w:sz w:val="20"/>
+              </w:rPr>
+              <w:t>Fix the steps that lose the most people first.</w:t>
+            </w:r>
+          </w:p>
+        </w:tc>
+      </w:tr>
+    </w:tbl>
+    <w:p>
+      <w:pPr>
+        <w:spacing w:before="0" w:after="80"/>
+      </w:pPr>
+    </w:p>
     <w:tbl>
       <w:tblPr>
         <w:tblW w:w="9598" w:type="dxa"/>
@@ -7051,7 +9136,7 @@
             </w:pPr>
             <w:r>
               <w:rPr/>
-              <w:t>Pedalo, Nina, Sam, Yusuf and Clara are made up for this example. That many options can make people choose less follows Iyengar and Lepper (2000); the matrix is a reading of the example, not a score.</w:t>
+              <w:t>Pedalo, Nina, Sam, Yusuf and Clara are made up for this example. That many options can make people choose less follows Iyengar and Lepper (2000); the matrix is a reading of the example, not a score. The findings in the table of real evidence are real research results, rules and cases; the sources are listed below.</w:t>
             </w:r>
           </w:p>
         </w:tc>
@@ -7240,7 +9325,7 @@
           <w:color w:val="556274"/>
           <w:sz w:val="18"/>
         </w:rPr>
-        <w:t>Iyengar &amp; Lepper 2000 · Gibbons 2018 · Hick 1952</w:t>
+        <w:t>Iyengar &amp; Lepper 2000 · Gibbons 2018 · Hick 1952 · Larson &amp; Czerwinski 1998 · Nielsen 2000 · Baymard Institute 2024</w:t>
       </w:r>
     </w:p>
     <w:p>
@@ -7354,7 +9439,7 @@
             </w:r>
             <w:r>
               <w:rPr/>
-              <w:t xml:space="preserve"> The four boxes at the top are the parts of a decision, filled in for Pedalo. The two boxes below are the rule for future decisions.</w:t>
+              <w:t xml:space="preserve"> The four boxes at the top are the parts of a decision, filled in for Pedalo. The two boxes below are the rule for future decisions. A table of evidence and rules follows.</w:t>
             </w:r>
           </w:p>
         </w:tc>
@@ -7680,6 +9765,266 @@
         <w:spacing w:before="0" w:after="80"/>
       </w:pPr>
     </w:p>
+    <w:p>
+      <w:pPr>
+        <w:spacing w:before="0" w:after="100"/>
+      </w:pPr>
+      <w:r>
+        <w:rPr>
+          <w:b/>
+        </w:rPr>
+        <w:t>Who owns the interaction logic: evidence and rules</w:t>
+      </w:r>
+    </w:p>
+    <w:tbl>
+      <w:tblPr>
+        <w:tblW w:w="9638" w:type="dxa"/>
+        <w:tblBorders>
+          <w:top w:val="single" w:sz="4" w:space="0" w:color="D5DEE9"/>
+          <w:left w:val="single" w:sz="4" w:space="0" w:color="D5DEE9"/>
+          <w:bottom w:val="single" w:sz="4" w:space="0" w:color="D5DEE9"/>
+          <w:right w:val="single" w:sz="4" w:space="0" w:color="D5DEE9"/>
+          <w:insideH w:val="single" w:sz="4" w:space="0" w:color="D5DEE9"/>
+          <w:insideV w:val="single" w:sz="4" w:space="0" w:color="D5DEE9"/>
+        </w:tblBorders>
+        <w:tblLayout w:type="fixed"/>
+        <w:tblCellMar>
+          <w:top w:w="60" w:type="dxa"/>
+          <w:left w:w="100" w:type="dxa"/>
+          <w:bottom w:w="60" w:type="dxa"/>
+          <w:right w:w="100" w:type="dxa"/>
+        </w:tblCellMar>
+      </w:tblPr>
+      <w:tblGrid>
+        <w:gridCol w:w="1526"/>
+        <w:gridCol w:w="4635"/>
+        <w:gridCol w:w="3477"/>
+      </w:tblGrid>
+      <w:tr>
+        <w:trPr>
+          <w:cantSplit/>
+          <w:tblHeader/>
+        </w:trPr>
+        <w:tc>
+          <w:tcPr>
+            <w:tcW w:type="dxa" w:w="1526"/>
+            <w:shd w:val="clear" w:color="auto" w:fill="E6ECF4"/>
+          </w:tcPr>
+          <w:p>
+            <w:pPr>
+              <w:spacing w:before="0" w:after="0"/>
+            </w:pPr>
+            <w:r>
+              <w:rPr>
+                <w:b/>
+                <w:sz w:val="20"/>
+              </w:rPr>
+              <w:t>Part</w:t>
+            </w:r>
+          </w:p>
+        </w:tc>
+        <w:tc>
+          <w:tcPr>
+            <w:tcW w:type="dxa" w:w="4635"/>
+            <w:shd w:val="clear" w:color="auto" w:fill="E6ECF4"/>
+          </w:tcPr>
+          <w:p>
+            <w:pPr>
+              <w:spacing w:before="0" w:after="0"/>
+            </w:pPr>
+            <w:r>
+              <w:rPr>
+                <w:b/>
+                <w:sz w:val="20"/>
+              </w:rPr>
+              <w:t>Evidence or rule</w:t>
+            </w:r>
+          </w:p>
+        </w:tc>
+        <w:tc>
+          <w:tcPr>
+            <w:tcW w:type="dxa" w:w="3477"/>
+            <w:shd w:val="clear" w:color="auto" w:fill="E6ECF4"/>
+          </w:tcPr>
+          <w:p>
+            <w:pPr>
+              <w:spacing w:before="0" w:after="0"/>
+            </w:pPr>
+            <w:r>
+              <w:rPr>
+                <w:b/>
+                <w:sz w:val="20"/>
+              </w:rPr>
+              <w:t>What it means</w:t>
+            </w:r>
+          </w:p>
+        </w:tc>
+      </w:tr>
+      <w:tr>
+        <w:trPr>
+          <w:cantSplit/>
+        </w:trPr>
+        <w:tc>
+          <w:tcPr>
+            <w:tcW w:type="dxa" w:w="1526"/>
+          </w:tcPr>
+          <w:p>
+            <w:pPr>
+              <w:spacing w:before="0" w:after="0"/>
+            </w:pPr>
+            <w:r>
+              <w:rPr>
+                <w:sz w:val="20"/>
+              </w:rPr>
+              <w:t>Ownership</w:t>
+            </w:r>
+          </w:p>
+        </w:tc>
+        <w:tc>
+          <w:tcPr>
+            <w:tcW w:type="dxa" w:w="4635"/>
+          </w:tcPr>
+          <w:p>
+            <w:pPr>
+              <w:spacing w:before="0" w:after="0"/>
+            </w:pPr>
+            <w:r>
+              <w:rPr>
+                <w:sz w:val="20"/>
+              </w:rPr>
+              <w:t>The structure of a product tends to copy the structure of the organisation behind it (Conway 1968).</w:t>
+            </w:r>
+          </w:p>
+        </w:tc>
+        <w:tc>
+          <w:tcPr>
+            <w:tcW w:type="dxa" w:w="3477"/>
+          </w:tcPr>
+          <w:p>
+            <w:pPr>
+              <w:spacing w:before="0" w:after="0"/>
+            </w:pPr>
+            <w:r>
+              <w:rPr>
+                <w:sz w:val="20"/>
+              </w:rPr>
+              <w:t>Name one owner of the order of tasks and steps, or each department will shape its own.</w:t>
+            </w:r>
+          </w:p>
+        </w:tc>
+      </w:tr>
+      <w:tr>
+        <w:trPr>
+          <w:cantSplit/>
+        </w:trPr>
+        <w:tc>
+          <w:tcPr>
+            <w:tcW w:type="dxa" w:w="1526"/>
+          </w:tcPr>
+          <w:p>
+            <w:pPr>
+              <w:spacing w:before="0" w:after="0"/>
+            </w:pPr>
+            <w:r>
+              <w:rPr>
+                <w:sz w:val="20"/>
+              </w:rPr>
+              <w:t>Shared rules</w:t>
+            </w:r>
+          </w:p>
+        </w:tc>
+        <w:tc>
+          <w:tcPr>
+            <w:tcW w:type="dxa" w:w="4635"/>
+          </w:tcPr>
+          <w:p>
+            <w:pPr>
+              <w:spacing w:before="0" w:after="0"/>
+            </w:pPr>
+            <w:r>
+              <w:rPr>
+                <w:sz w:val="20"/>
+              </w:rPr>
+              <w:t>Interfaces built from shared rules and components stay consistent (Frost 2016); ISO 9241-110 gives seven principles to decide by.</w:t>
+            </w:r>
+          </w:p>
+        </w:tc>
+        <w:tc>
+          <w:tcPr>
+            <w:tcW w:type="dxa" w:w="3477"/>
+          </w:tcPr>
+          <w:p>
+            <w:pPr>
+              <w:spacing w:before="0" w:after="0"/>
+            </w:pPr>
+            <w:r>
+              <w:rPr>
+                <w:sz w:val="20"/>
+              </w:rPr>
+              <w:t>Write the rules down once and let teams build within them.</w:t>
+            </w:r>
+          </w:p>
+        </w:tc>
+      </w:tr>
+      <w:tr>
+        <w:trPr>
+          <w:cantSplit/>
+        </w:trPr>
+        <w:tc>
+          <w:tcPr>
+            <w:tcW w:type="dxa" w:w="1526"/>
+          </w:tcPr>
+          <w:p>
+            <w:pPr>
+              <w:spacing w:before="0" w:after="0"/>
+            </w:pPr>
+            <w:r>
+              <w:rPr>
+                <w:sz w:val="20"/>
+              </w:rPr>
+              <w:t>A floor</w:t>
+            </w:r>
+          </w:p>
+        </w:tc>
+        <w:tc>
+          <w:tcPr>
+            <w:tcW w:type="dxa" w:w="4635"/>
+          </w:tcPr>
+          <w:p>
+            <w:pPr>
+              <w:spacing w:before="0" w:after="0"/>
+            </w:pPr>
+            <w:r>
+              <w:rPr>
+                <w:sz w:val="20"/>
+              </w:rPr>
+              <w:t>WCAG 2.2 fixes minimum target sizes and spacing.</w:t>
+            </w:r>
+          </w:p>
+        </w:tc>
+        <w:tc>
+          <w:tcPr>
+            <w:tcW w:type="dxa" w:w="3477"/>
+          </w:tcPr>
+          <w:p>
+            <w:pPr>
+              <w:spacing w:before="0" w:after="0"/>
+            </w:pPr>
+            <w:r>
+              <w:rPr>
+                <w:sz w:val="20"/>
+              </w:rPr>
+              <w:t>Treat the target size as a rule, not as a taste.</w:t>
+            </w:r>
+          </w:p>
+        </w:tc>
+      </w:tr>
+    </w:tbl>
+    <w:p>
+      <w:pPr>
+        <w:spacing w:before="0" w:after="80"/>
+      </w:pPr>
+    </w:p>
     <w:tbl>
       <w:tblPr>
         <w:tblW w:w="9598" w:type="dxa"/>
@@ -7729,7 +10074,7 @@
             </w:pPr>
             <w:r>
               <w:rPr/>
-              <w:t>Pedalo, Nina, Sam, Yusuf and Clara are made up for this example. Deciding with limited information follows Simon (1956); the premortem follows Klein (2007).</w:t>
+              <w:t>Pedalo, Nina, Sam, Yusuf and Clara are made up for this example. Deciding with limited information follows Simon (1956); the premortem follows Klein (2007). The findings in the table of real evidence are real research results, rules and cases; the sources are listed below.</w:t>
             </w:r>
           </w:p>
         </w:tc>
@@ -7908,7 +10253,7 @@
           <w:color w:val="556274"/>
           <w:sz w:val="18"/>
         </w:rPr>
-        <w:t>Simon 1956 · Klein 2007 · ISO 9241-110</w:t>
+        <w:t>Simon 1956 · Klein 2007 · ISO 9241-110 · Conway 1968 · Frost 2016 · WCAG 2.2</w:t>
       </w:r>
     </w:p>
     <w:p>
@@ -8593,6 +10938,54 @@
         <w:rPr>
           <w:sz w:val="19"/>
         </w:rPr>
+        <w:t>Raskin, J. (1994). Viewpoint: Intuitive equals familiar. Communications of the ACM, 37(9), 17–18. (An interface is called intuitive when it uses skills that people already have.)</w:t>
+      </w:r>
+    </w:p>
+    <w:p>
+      <w:pPr>
+        <w:spacing w:before="0" w:after="80"/>
+        <w:ind w:left="283" w:hanging="283"/>
+      </w:pPr>
+      <w:r>
+        <w:rPr>
+          <w:sz w:val="19"/>
+        </w:rPr>
+        <w:t>Baymard Institute (2024). Cart Abandonment Rate Statistics. https://baymard.com/lists/cart-abandonment-rate (Average cart abandonment of 70.19% across all reasons; in the checkout study, 17% of the US online shoppers had abandoned an order in the past quarter because the checkout seemed too long or complicated; the figures change with the study year.)</w:t>
+      </w:r>
+    </w:p>
+    <w:p>
+      <w:pPr>
+        <w:spacing w:before="0" w:after="80"/>
+        <w:ind w:left="283" w:hanging="283"/>
+      </w:pPr>
+      <w:r>
+        <w:rPr>
+          <w:sz w:val="19"/>
+        </w:rPr>
+        <w:t>Rayner, K. (1998). Eye movements in reading and information processing: 20 years of research. Psychological Bulletin, 124(3), 372–422. (Only the fovea, about 2° of the visual field, sees sharply; the eyes jump in saccades and rest in fixations of about 200 to 300 ms, taking in information only while they rest.)</w:t>
+      </w:r>
+    </w:p>
+    <w:p>
+      <w:pPr>
+        <w:spacing w:before="0" w:after="80"/>
+        <w:ind w:left="283" w:hanging="283"/>
+      </w:pPr>
+      <w:r>
+        <w:rPr>
+          <w:sz w:val="19"/>
+        </w:rPr>
+        <w:t>Cowan, N. (2001). The magical number 4 in short-term memory: A reconsideration of mental storage capacity. Behavioral and Brain Sciences, 24(1), 87–114. (The limit of working memory is nearer four chunks than seven.)</w:t>
+      </w:r>
+    </w:p>
+    <w:p>
+      <w:pPr>
+        <w:spacing w:before="0" w:after="80"/>
+        <w:ind w:left="283" w:hanging="283"/>
+      </w:pPr>
+      <w:r>
+        <w:rPr>
+          <w:sz w:val="19"/>
+        </w:rPr>
         <w:t>Hick, W. E. (1952). On the rate of gain of information. Quarterly Journal of Experimental Psychology, 4(1), 11–26. (Choice reaction time rises with the number of equally likely alternatives: Hick's law.)</w:t>
       </w:r>
     </w:p>
@@ -8641,7 +11034,67 @@
         <w:rPr>
           <w:sz w:val="19"/>
         </w:rPr>
+        <w:t>Larson, K., &amp; Czerwinski, M. (1998). Web page design: Implications of memory, structure and scent for information retrieval. CHI '98, 25–32. https://doi.org/10.1145/274644.274649 (More depth harmed search on the web, and a medium structure of depth and breadth beat the broadest, shallowest one.)</w:t>
+      </w:r>
+    </w:p>
+    <w:p>
+      <w:pPr>
+        <w:spacing w:before="0" w:after="80"/>
+        <w:ind w:left="283" w:hanging="283"/>
+      </w:pPr>
+      <w:r>
+        <w:rPr>
+          <w:sz w:val="19"/>
+        </w:rPr>
         <w:t>Fitts, P. M. (1954). The information capacity of the human motor system in controlling the amplitude of movement. Journal of Experimental Psychology, 47(6), 381–391. (The time to reach a target grows with its distance and shrinks with its size: Fitts's law.)</w:t>
+      </w:r>
+    </w:p>
+    <w:p>
+      <w:pPr>
+        <w:spacing w:before="0" w:after="80"/>
+        <w:ind w:left="283" w:hanging="283"/>
+      </w:pPr>
+      <w:r>
+        <w:rPr>
+          <w:sz w:val="19"/>
+        </w:rPr>
+        <w:t>W3C (2023). Web Content Accessibility Guidelines (WCAG) 2.2. https://www.w3.org/TR/WCAG22/ (Success criterion 1.4.1 Use of Color: colour must not be the only way to convey information; 1.4.3 Contrast (Minimum) for text.)</w:t>
+      </w:r>
+    </w:p>
+    <w:p>
+      <w:pPr>
+        <w:spacing w:before="0" w:after="80"/>
+        <w:ind w:left="283" w:hanging="283"/>
+      </w:pPr>
+      <w:r>
+        <w:rPr>
+          <w:sz w:val="19"/>
+        </w:rPr>
+        <w:t>Apple (current). Human Interface Guidelines: Typography. https://developer.apple.com/design/human-interface-guidelines/typography (Named text styles for roles such as title and body, Dynamic Type that lets people choose their text size, and a default size of 17 points and a minimum of 11 points on iOS; check the current page.)</w:t>
+      </w:r>
+    </w:p>
+    <w:p>
+      <w:pPr>
+        <w:spacing w:before="0" w:after="80"/>
+        <w:ind w:left="283" w:hanging="283"/>
+      </w:pPr>
+      <w:r>
+        <w:rPr>
+          <w:sz w:val="19"/>
+        </w:rPr>
+        <w:t>Nielsen, J. (2000). End of Web Design. Nielsen Norman Group. https://www.nngroup.com/articles/end-of-web-design/ (Users spend most of their time on other sites, so they expect a site to work like the ones they already know: later called Jakob's Law.)</w:t>
+      </w:r>
+    </w:p>
+    <w:p>
+      <w:pPr>
+        <w:spacing w:before="0" w:after="80"/>
+        <w:ind w:left="283" w:hanging="283"/>
+      </w:pPr>
+      <w:r>
+        <w:rPr>
+          <w:sz w:val="19"/>
+        </w:rPr>
+        <w:t>Nielsen, J. (1994, reviewed 2024). 10 Usability Heuristics for User Interface Design. Nielsen Norman Group. https://www.nngroup.com/articles/ten-usability-heuristics/ (Visibility of system status, consistency and standards, recognition rather than recall, aesthetic and minimalist design.)</w:t>
       </w:r>
     </w:p>
     <w:p>
@@ -8665,18 +11118,6 @@
         <w:rPr>
           <w:sz w:val="19"/>
         </w:rPr>
-        <w:t>Cowan, N. (2001). The magical number 4 in short-term memory: A reconsideration of mental storage capacity. Behavioral and Brain Sciences, 24(1), 87–114. (The limit of working memory is nearer four chunks than seven.)</w:t>
-      </w:r>
-    </w:p>
-    <w:p>
-      <w:pPr>
-        <w:spacing w:before="0" w:after="80"/>
-        <w:ind w:left="283" w:hanging="283"/>
-      </w:pPr>
-      <w:r>
-        <w:rPr>
-          <w:sz w:val="19"/>
-        </w:rPr>
         <w:t>Sweller, J. (1988). Cognitive load during problem solving: Effects on learning. Cognitive Science, 12(2), 257–285. https://doi.org/10.1207/s15516709cog1202_4 (Working memory is limited; effort spent on working out a screen is missing for the task itself.)</w:t>
       </w:r>
     </w:p>
@@ -8689,7 +11130,7 @@
         <w:rPr>
           <w:sz w:val="19"/>
         </w:rPr>
-        <w:t>Nielsen, J. (1994, reviewed 2024). 10 Usability Heuristics for User Interface Design. Nielsen Norman Group. https://www.nngroup.com/articles/ten-usability-heuristics/ (Visibility of system status, consistency and standards, recognition rather than recall, aesthetic and minimalist design.)</w:t>
+        <w:t>ISO 13616-1:2020. Financial services: International bank account number (IBAN), Part 1. (The IBAN is written in groups of four characters in print.)</w:t>
       </w:r>
     </w:p>
     <w:p>
@@ -8702,6 +11143,18 @@
           <w:sz w:val="19"/>
         </w:rPr>
         <w:t>Gibbons, S. (2018). Using Prioritization Matrices to Inform UX Decisions. Nielsen Norman Group. https://www.nngroup.com/articles/prioritization-matrices/ (Rate each option on the same few criteria, such as value to the user against effort, and put the reason next to each rating.)</w:t>
+      </w:r>
+    </w:p>
+    <w:p>
+      <w:pPr>
+        <w:spacing w:before="0" w:after="80"/>
+        <w:ind w:left="283" w:hanging="283"/>
+      </w:pPr>
+      <w:r>
+        <w:rPr>
+          <w:sz w:val="19"/>
+        </w:rPr>
+        <w:t>Hartman, P., Bezos, J. P., Kaphan, S., &amp; Spiegel, J. (1999). Method and system for placing a purchase order via a communications network. US Patent 5,960,411. (The patent behind one-click ordering: a purchase in one action by reusing stored data.)</w:t>
       </w:r>
     </w:p>
     <w:p>
@@ -8726,6 +11179,30 @@
           <w:sz w:val="19"/>
         </w:rPr>
         <w:t>Klein, G. (2007). Performing a project premortem. Harvard Business Review, 85(9), 18–19. (Imagine the plan has failed and ask why; it brings risks and wrong assumptions to the surface before the work starts.)</w:t>
+      </w:r>
+    </w:p>
+    <w:p>
+      <w:pPr>
+        <w:spacing w:before="0" w:after="80"/>
+        <w:ind w:left="283" w:hanging="283"/>
+      </w:pPr>
+      <w:r>
+        <w:rPr>
+          <w:sz w:val="19"/>
+        </w:rPr>
+        <w:t>Conway, M. E. (1968). How do committees invent? Datamation, 14(4), 28–31. (Organisations tend to produce designs that copy their own communication structure: the menu mirrors the departments.)</w:t>
+      </w:r>
+    </w:p>
+    <w:p>
+      <w:pPr>
+        <w:spacing w:before="0" w:after="80"/>
+        <w:ind w:left="283" w:hanging="283"/>
+      </w:pPr>
+      <w:r>
+        <w:rPr>
+          <w:sz w:val="19"/>
+        </w:rPr>
+        <w:t>Frost, B. (2016). Atomic Design. Brad Frost. https://atomicdesign.bradfrost.com/ (Interfaces built from shared rules and components, from colours and type styles up to whole pages, so every screen stays consistent.)</w:t>
       </w:r>
     </w:p>
     <w:p>
@@ -8774,10 +11251,10 @@
         </w:tblCellMar>
       </w:tblPr>
       <w:tblGrid>
-        <w:gridCol w:w="1880"/>
-        <w:gridCol w:w="5427"/>
-        <w:gridCol w:w="1423"/>
-        <w:gridCol w:w="908"/>
+        <w:gridCol w:w="1886"/>
+        <w:gridCol w:w="5426"/>
+        <w:gridCol w:w="1417"/>
+        <w:gridCol w:w="909"/>
       </w:tblGrid>
       <w:tr>
         <w:trPr>
@@ -8786,7 +11263,7 @@
         </w:trPr>
         <w:tc>
           <w:tcPr>
-            <w:tcW w:type="dxa" w:w="1880"/>
+            <w:tcW w:type="dxa" w:w="1886"/>
             <w:shd w:val="clear" w:color="auto" w:fill="E6ECF4"/>
           </w:tcPr>
           <w:p>
@@ -8804,7 +11281,7 @@
         </w:tc>
         <w:tc>
           <w:tcPr>
-            <w:tcW w:type="dxa" w:w="5427"/>
+            <w:tcW w:type="dxa" w:w="5426"/>
             <w:shd w:val="clear" w:color="auto" w:fill="E6ECF4"/>
           </w:tcPr>
           <w:p>
@@ -8822,7 +11299,7 @@
         </w:tc>
         <w:tc>
           <w:tcPr>
-            <w:tcW w:type="dxa" w:w="1423"/>
+            <w:tcW w:type="dxa" w:w="1417"/>
             <w:shd w:val="clear" w:color="auto" w:fill="E6ECF4"/>
           </w:tcPr>
           <w:p>
@@ -8840,7 +11317,7 @@
         </w:tc>
         <w:tc>
           <w:tcPr>
-            <w:tcW w:type="dxa" w:w="908"/>
+            <w:tcW w:type="dxa" w:w="909"/>
             <w:shd w:val="clear" w:color="auto" w:fill="E6ECF4"/>
           </w:tcPr>
           <w:p>
@@ -8863,7 +11340,7 @@
         </w:trPr>
         <w:tc>
           <w:tcPr>
-            <w:tcW w:type="dxa" w:w="1880"/>
+            <w:tcW w:type="dxa" w:w="1886"/>
           </w:tcPr>
           <w:p>
             <w:pPr>
@@ -8874,13 +11351,13 @@
                 <w:b/>
                 <w:sz w:val="19"/>
               </w:rPr>
-              <w:t>Action logic</w:t>
-            </w:r>
-          </w:p>
-        </w:tc>
-        <w:tc>
-          <w:tcPr>
-            <w:tcW w:type="dxa" w:w="5427"/>
+              <w:t>Abandonment rate</w:t>
+            </w:r>
+          </w:p>
+        </w:tc>
+        <w:tc>
+          <w:tcPr>
+            <w:tcW w:type="dxa" w:w="5426"/>
           </w:tcPr>
           <w:p>
             <w:pPr>
@@ -8890,13 +11367,13 @@
               <w:rPr>
                 <w:sz w:val="19"/>
               </w:rPr>
-              <w:t>The order in which a task runs: where it starts, which steps follow, what each step asks and how the person knows they are done.</w:t>
-            </w:r>
-          </w:p>
-        </w:tc>
-        <w:tc>
-          <w:tcPr>
-            <w:tcW w:type="dxa" w:w="1423"/>
+              <w:t>The share of people who start a process, such as a damage report, and leave before they finish it.</w:t>
+            </w:r>
+          </w:p>
+        </w:tc>
+        <w:tc>
+          <w:tcPr>
+            <w:tcW w:type="dxa" w:w="1417"/>
           </w:tcPr>
           <w:p>
             <w:pPr>
@@ -8912,7 +11389,7 @@
         </w:tc>
         <w:tc>
           <w:tcPr>
-            <w:tcW w:type="dxa" w:w="908"/>
+            <w:tcW w:type="dxa" w:w="909"/>
           </w:tcPr>
           <w:p>
             <w:pPr>
@@ -8922,7 +11399,7 @@
               <w:rPr>
                 <w:sz w:val="19"/>
               </w:rPr>
-              <w:t>Day 4</w:t>
+              <w:t>Day 1</w:t>
             </w:r>
           </w:p>
         </w:tc>
@@ -8933,7 +11410,7 @@
         </w:trPr>
         <w:tc>
           <w:tcPr>
-            <w:tcW w:type="dxa" w:w="1880"/>
+            <w:tcW w:type="dxa" w:w="1886"/>
           </w:tcPr>
           <w:p>
             <w:pPr>
@@ -8944,13 +11421,13 @@
                 <w:b/>
                 <w:sz w:val="19"/>
               </w:rPr>
-              <w:t>Attention</w:t>
-            </w:r>
-          </w:p>
-        </w:tc>
-        <w:tc>
-          <w:tcPr>
-            <w:tcW w:type="dxa" w:w="5427"/>
+              <w:t>Action logic</w:t>
+            </w:r>
+          </w:p>
+        </w:tc>
+        <w:tc>
+          <w:tcPr>
+            <w:tcW w:type="dxa" w:w="5426"/>
           </w:tcPr>
           <w:p>
             <w:pPr>
@@ -8960,13 +11437,13 @@
               <w:rPr>
                 <w:sz w:val="19"/>
               </w:rPr>
-              <w:t>The mind's spotlight. Only a small part of a screen is processed at any moment; attention decides which part.</w:t>
-            </w:r>
-          </w:p>
-        </w:tc>
-        <w:tc>
-          <w:tcPr>
-            <w:tcW w:type="dxa" w:w="1423"/>
+              <w:t>The order in which a task runs: where it starts, which steps follow, what each step asks and how the person knows they are done.</w:t>
+            </w:r>
+          </w:p>
+        </w:tc>
+        <w:tc>
+          <w:tcPr>
+            <w:tcW w:type="dxa" w:w="1417"/>
           </w:tcPr>
           <w:p>
             <w:pPr>
@@ -8976,13 +11453,13 @@
               <w:rPr>
                 <w:sz w:val="19"/>
               </w:rPr>
-              <w:t>A flashing banner takes attention away from the form you were filling in.</w:t>
-            </w:r>
-          </w:p>
-        </w:tc>
-        <w:tc>
-          <w:tcPr>
-            <w:tcW w:type="dxa" w:w="908"/>
+              <w:t>—</w:t>
+            </w:r>
+          </w:p>
+        </w:tc>
+        <w:tc>
+          <w:tcPr>
+            <w:tcW w:type="dxa" w:w="909"/>
           </w:tcPr>
           <w:p>
             <w:pPr>
@@ -8992,7 +11469,7 @@
               <w:rPr>
                 <w:sz w:val="19"/>
               </w:rPr>
-              <w:t>Day 1</w:t>
+              <w:t>Day 4</w:t>
             </w:r>
           </w:p>
         </w:tc>
@@ -9003,7 +11480,7 @@
         </w:trPr>
         <w:tc>
           <w:tcPr>
-            <w:tcW w:type="dxa" w:w="1880"/>
+            <w:tcW w:type="dxa" w:w="1886"/>
           </w:tcPr>
           <w:p>
             <w:pPr>
@@ -9014,13 +11491,13 @@
                 <w:b/>
                 <w:sz w:val="19"/>
               </w:rPr>
-              <w:t>Case assumption</w:t>
-            </w:r>
-          </w:p>
-        </w:tc>
-        <w:tc>
-          <w:tcPr>
-            <w:tcW w:type="dxa" w:w="5427"/>
+              <w:t>Attention</w:t>
+            </w:r>
+          </w:p>
+        </w:tc>
+        <w:tc>
+          <w:tcPr>
+            <w:tcW w:type="dxa" w:w="5426"/>
           </w:tcPr>
           <w:p>
             <w:pPr>
@@ -9030,13 +11507,13 @@
               <w:rPr>
                 <w:sz w:val="19"/>
               </w:rPr>
-              <w:t>A fact made up for this exercise to fill a gap in the plan's case. It is marked so you know it is not part of the plan.</w:t>
-            </w:r>
-          </w:p>
-        </w:tc>
-        <w:tc>
-          <w:tcPr>
-            <w:tcW w:type="dxa" w:w="1423"/>
+              <w:t>The mind's spotlight. Only a small part of a screen is processed at any moment; attention decides which part.</w:t>
+            </w:r>
+          </w:p>
+        </w:tc>
+        <w:tc>
+          <w:tcPr>
+            <w:tcW w:type="dxa" w:w="1417"/>
           </w:tcPr>
           <w:p>
             <w:pPr>
@@ -9046,13 +11523,13 @@
               <w:rPr>
                 <w:sz w:val="19"/>
               </w:rPr>
-              <w:t>—</w:t>
-            </w:r>
-          </w:p>
-        </w:tc>
-        <w:tc>
-          <w:tcPr>
-            <w:tcW w:type="dxa" w:w="908"/>
+              <w:t>A flashing banner takes attention away from the form you were filling in.</w:t>
+            </w:r>
+          </w:p>
+        </w:tc>
+        <w:tc>
+          <w:tcPr>
+            <w:tcW w:type="dxa" w:w="909"/>
           </w:tcPr>
           <w:p>
             <w:pPr>
@@ -9073,7 +11550,7 @@
         </w:trPr>
         <w:tc>
           <w:tcPr>
-            <w:tcW w:type="dxa" w:w="1880"/>
+            <w:tcW w:type="dxa" w:w="1886"/>
           </w:tcPr>
           <w:p>
             <w:pPr>
@@ -9084,13 +11561,13 @@
                 <w:b/>
                 <w:sz w:val="19"/>
               </w:rPr>
-              <w:t>Chief Experience Officer</w:t>
-            </w:r>
-          </w:p>
-        </w:tc>
-        <w:tc>
-          <w:tcPr>
-            <w:tcW w:type="dxa" w:w="5427"/>
+              <w:t>Case assumption</w:t>
+            </w:r>
+          </w:p>
+        </w:tc>
+        <w:tc>
+          <w:tcPr>
+            <w:tcW w:type="dxa" w:w="5426"/>
           </w:tcPr>
           <w:p>
             <w:pPr>
@@ -9100,13 +11577,13 @@
               <w:rPr>
                 <w:sz w:val="19"/>
               </w:rPr>
-              <w:t>The manager who is responsible for the experience customers have across all channels, and who decides where the company invests in it.</w:t>
-            </w:r>
-          </w:p>
-        </w:tc>
-        <w:tc>
-          <w:tcPr>
-            <w:tcW w:type="dxa" w:w="1423"/>
+              <w:t>A fact made up for this exercise to fill a gap in the plan's case. It is marked so you know it is not part of the plan.</w:t>
+            </w:r>
+          </w:p>
+        </w:tc>
+        <w:tc>
+          <w:tcPr>
+            <w:tcW w:type="dxa" w:w="1417"/>
           </w:tcPr>
           <w:p>
             <w:pPr>
@@ -9122,7 +11599,7 @@
         </w:tc>
         <w:tc>
           <w:tcPr>
-            <w:tcW w:type="dxa" w:w="908"/>
+            <w:tcW w:type="dxa" w:w="909"/>
           </w:tcPr>
           <w:p>
             <w:pPr>
@@ -9143,7 +11620,7 @@
         </w:trPr>
         <w:tc>
           <w:tcPr>
-            <w:tcW w:type="dxa" w:w="1880"/>
+            <w:tcW w:type="dxa" w:w="1886"/>
           </w:tcPr>
           <w:p>
             <w:pPr>
@@ -9154,13 +11631,13 @@
                 <w:b/>
                 <w:sz w:val="19"/>
               </w:rPr>
-              <w:t>Chunk</w:t>
-            </w:r>
-          </w:p>
-        </w:tc>
-        <w:tc>
-          <w:tcPr>
-            <w:tcW w:type="dxa" w:w="5427"/>
+              <w:t>Chief Experience Officer</w:t>
+            </w:r>
+          </w:p>
+        </w:tc>
+        <w:tc>
+          <w:tcPr>
+            <w:tcW w:type="dxa" w:w="5426"/>
           </w:tcPr>
           <w:p>
             <w:pPr>
@@ -9170,13 +11647,13 @@
               <w:rPr>
                 <w:sz w:val="19"/>
               </w:rPr>
-              <w:t>A group of items the memory treats as one, such as a phone number split into blocks. Grouping information into chunks makes it easier to hold.</w:t>
-            </w:r>
-          </w:p>
-        </w:tc>
-        <w:tc>
-          <w:tcPr>
-            <w:tcW w:type="dxa" w:w="1423"/>
+              <w:t>The manager who is responsible for the experience customers have across all channels, and who decides where the company invests in it.</w:t>
+            </w:r>
+          </w:p>
+        </w:tc>
+        <w:tc>
+          <w:tcPr>
+            <w:tcW w:type="dxa" w:w="1417"/>
           </w:tcPr>
           <w:p>
             <w:pPr>
@@ -9192,7 +11669,7 @@
         </w:tc>
         <w:tc>
           <w:tcPr>
-            <w:tcW w:type="dxa" w:w="908"/>
+            <w:tcW w:type="dxa" w:w="909"/>
           </w:tcPr>
           <w:p>
             <w:pPr>
@@ -9202,7 +11679,7 @@
               <w:rPr>
                 <w:sz w:val="19"/>
               </w:rPr>
-              <w:t>Day 4</w:t>
+              <w:t>Day 1</w:t>
             </w:r>
           </w:p>
         </w:tc>
@@ -9213,7 +11690,7 @@
         </w:trPr>
         <w:tc>
           <w:tcPr>
-            <w:tcW w:type="dxa" w:w="1880"/>
+            <w:tcW w:type="dxa" w:w="1886"/>
           </w:tcPr>
           <w:p>
             <w:pPr>
@@ -9224,13 +11701,13 @@
                 <w:b/>
                 <w:sz w:val="19"/>
               </w:rPr>
-              <w:t>Cognition</w:t>
-            </w:r>
-          </w:p>
-        </w:tc>
-        <w:tc>
-          <w:tcPr>
-            <w:tcW w:type="dxa" w:w="5427"/>
+              <w:t>Chunk</w:t>
+            </w:r>
+          </w:p>
+        </w:tc>
+        <w:tc>
+          <w:tcPr>
+            <w:tcW w:type="dxa" w:w="5426"/>
           </w:tcPr>
           <w:p>
             <w:pPr>
@@ -9240,13 +11717,13 @@
               <w:rPr>
                 <w:sz w:val="19"/>
               </w:rPr>
-              <w:t>The thinking side of the mind: remembering, comparing, understanding and deciding.</w:t>
-            </w:r>
-          </w:p>
-        </w:tc>
-        <w:tc>
-          <w:tcPr>
-            <w:tcW w:type="dxa" w:w="1423"/>
+              <w:t>A group of items the memory treats as one, such as a phone number split into blocks. Grouping information into chunks makes it easier to hold.</w:t>
+            </w:r>
+          </w:p>
+        </w:tc>
+        <w:tc>
+          <w:tcPr>
+            <w:tcW w:type="dxa" w:w="1417"/>
           </w:tcPr>
           <w:p>
             <w:pPr>
@@ -9262,7 +11739,7 @@
         </w:tc>
         <w:tc>
           <w:tcPr>
-            <w:tcW w:type="dxa" w:w="908"/>
+            <w:tcW w:type="dxa" w:w="909"/>
           </w:tcPr>
           <w:p>
             <w:pPr>
@@ -9272,7 +11749,7 @@
               <w:rPr>
                 <w:sz w:val="19"/>
               </w:rPr>
-              <w:t>Day 1</w:t>
+              <w:t>Day 4</w:t>
             </w:r>
           </w:p>
         </w:tc>
@@ -9283,7 +11760,7 @@
         </w:trPr>
         <w:tc>
           <w:tcPr>
-            <w:tcW w:type="dxa" w:w="1880"/>
+            <w:tcW w:type="dxa" w:w="1886"/>
           </w:tcPr>
           <w:p>
             <w:pPr>
@@ -9294,13 +11771,13 @@
                 <w:b/>
                 <w:sz w:val="19"/>
               </w:rPr>
-              <w:t>Cognitive load</w:t>
-            </w:r>
-          </w:p>
-        </w:tc>
-        <w:tc>
-          <w:tcPr>
-            <w:tcW w:type="dxa" w:w="5427"/>
+              <w:t>Cognition</w:t>
+            </w:r>
+          </w:p>
+        </w:tc>
+        <w:tc>
+          <w:tcPr>
+            <w:tcW w:type="dxa" w:w="5426"/>
           </w:tcPr>
           <w:p>
             <w:pPr>
@@ -9310,13 +11787,13 @@
               <w:rPr>
                 <w:sz w:val="19"/>
               </w:rPr>
-              <w:t>How much a person has to hold in mind and work out at the same time. Every extra signal or choice adds to it; when it is too high, people skip, freeze or leave.</w:t>
-            </w:r>
-          </w:p>
-        </w:tc>
-        <w:tc>
-          <w:tcPr>
-            <w:tcW w:type="dxa" w:w="1423"/>
+              <w:t>The thinking side of the mind: remembering, comparing, understanding and deciding.</w:t>
+            </w:r>
+          </w:p>
+        </w:tc>
+        <w:tc>
+          <w:tcPr>
+            <w:tcW w:type="dxa" w:w="1417"/>
           </w:tcPr>
           <w:p>
             <w:pPr>
@@ -9332,7 +11809,7 @@
         </w:tc>
         <w:tc>
           <w:tcPr>
-            <w:tcW w:type="dxa" w:w="908"/>
+            <w:tcW w:type="dxa" w:w="909"/>
           </w:tcPr>
           <w:p>
             <w:pPr>
@@ -9353,7 +11830,7 @@
         </w:trPr>
         <w:tc>
           <w:tcPr>
-            <w:tcW w:type="dxa" w:w="1880"/>
+            <w:tcW w:type="dxa" w:w="1886"/>
           </w:tcPr>
           <w:p>
             <w:pPr>
@@ -9364,13 +11841,13 @@
                 <w:b/>
                 <w:sz w:val="19"/>
               </w:rPr>
-              <w:t>Conformity with expectations</w:t>
-            </w:r>
-          </w:p>
-        </w:tc>
-        <w:tc>
-          <w:tcPr>
-            <w:tcW w:type="dxa" w:w="5427"/>
+              <w:t>Cognitive load</w:t>
+            </w:r>
+          </w:p>
+        </w:tc>
+        <w:tc>
+          <w:tcPr>
+            <w:tcW w:type="dxa" w:w="5426"/>
           </w:tcPr>
           <w:p>
             <w:pPr>
@@ -9380,13 +11857,13 @@
               <w:rPr>
                 <w:sz w:val="19"/>
               </w:rPr>
-              <w:t>An interface behaves the way people expect from other products and from its own earlier screens: the menu where menus usually are, the same element working the same way.</w:t>
-            </w:r>
-          </w:p>
-        </w:tc>
-        <w:tc>
-          <w:tcPr>
-            <w:tcW w:type="dxa" w:w="1423"/>
+              <w:t>How much a person has to hold in mind and work out at the same time. Every extra signal or choice adds to it; when it is too high, people skip, freeze or leave.</w:t>
+            </w:r>
+          </w:p>
+        </w:tc>
+        <w:tc>
+          <w:tcPr>
+            <w:tcW w:type="dxa" w:w="1417"/>
           </w:tcPr>
           <w:p>
             <w:pPr>
@@ -9402,7 +11879,7 @@
         </w:tc>
         <w:tc>
           <w:tcPr>
-            <w:tcW w:type="dxa" w:w="908"/>
+            <w:tcW w:type="dxa" w:w="909"/>
           </w:tcPr>
           <w:p>
             <w:pPr>
@@ -9412,7 +11889,7 @@
               <w:rPr>
                 <w:sz w:val="19"/>
               </w:rPr>
-              <w:t>Day 4</w:t>
+              <w:t>Day 1</w:t>
             </w:r>
           </w:p>
         </w:tc>
@@ -9423,7 +11900,7 @@
         </w:trPr>
         <w:tc>
           <w:tcPr>
-            <w:tcW w:type="dxa" w:w="1880"/>
+            <w:tcW w:type="dxa" w:w="1886"/>
           </w:tcPr>
           <w:p>
             <w:pPr>
@@ -9434,13 +11911,13 @@
                 <w:b/>
                 <w:sz w:val="19"/>
               </w:rPr>
-              <w:t>Consistency</w:t>
-            </w:r>
-          </w:p>
-        </w:tc>
-        <w:tc>
-          <w:tcPr>
-            <w:tcW w:type="dxa" w:w="5427"/>
+              <w:t>Conformity with expectations</w:t>
+            </w:r>
+          </w:p>
+        </w:tc>
+        <w:tc>
+          <w:tcPr>
+            <w:tcW w:type="dxa" w:w="5426"/>
           </w:tcPr>
           <w:p>
             <w:pPr>
@@ -9450,13 +11927,13 @@
               <w:rPr>
                 <w:sz w:val="19"/>
               </w:rPr>
-              <w:t>The same thing looks, is named and works the same way everywhere, so what people learn on one page holds on the next.</w:t>
-            </w:r>
-          </w:p>
-        </w:tc>
-        <w:tc>
-          <w:tcPr>
-            <w:tcW w:type="dxa" w:w="1423"/>
+              <w:t>An interface behaves the way people expect from other products and from its own earlier screens: the menu where menus usually are, the same element working the same way.</w:t>
+            </w:r>
+          </w:p>
+        </w:tc>
+        <w:tc>
+          <w:tcPr>
+            <w:tcW w:type="dxa" w:w="1417"/>
           </w:tcPr>
           <w:p>
             <w:pPr>
@@ -9472,7 +11949,7 @@
         </w:tc>
         <w:tc>
           <w:tcPr>
-            <w:tcW w:type="dxa" w:w="908"/>
+            <w:tcW w:type="dxa" w:w="909"/>
           </w:tcPr>
           <w:p>
             <w:pPr>
@@ -9482,7 +11959,7 @@
               <w:rPr>
                 <w:sz w:val="19"/>
               </w:rPr>
-              <w:t>Day 2</w:t>
+              <w:t>Day 4</w:t>
             </w:r>
           </w:p>
         </w:tc>
@@ -9493,7 +11970,7 @@
         </w:trPr>
         <w:tc>
           <w:tcPr>
-            <w:tcW w:type="dxa" w:w="1880"/>
+            <w:tcW w:type="dxa" w:w="1886"/>
           </w:tcPr>
           <w:p>
             <w:pPr>
@@ -9504,13 +11981,13 @@
                 <w:b/>
                 <w:sz w:val="19"/>
               </w:rPr>
-              <w:t>Decision effort</w:t>
-            </w:r>
-          </w:p>
-        </w:tc>
-        <w:tc>
-          <w:tcPr>
-            <w:tcW w:type="dxa" w:w="5427"/>
+              <w:t>Consistency</w:t>
+            </w:r>
+          </w:p>
+        </w:tc>
+        <w:tc>
+          <w:tcPr>
+            <w:tcW w:type="dxa" w:w="5426"/>
           </w:tcPr>
           <w:p>
             <w:pPr>
@@ -9520,13 +11997,13 @@
               <w:rPr>
                 <w:sz w:val="19"/>
               </w:rPr>
-              <w:t>The mental work of comparing options and choosing one. Many equal options raise it.</w:t>
-            </w:r>
-          </w:p>
-        </w:tc>
-        <w:tc>
-          <w:tcPr>
-            <w:tcW w:type="dxa" w:w="1423"/>
+              <w:t>The same thing looks, is named and works the same way everywhere, so what people learn on one page holds on the next.</w:t>
+            </w:r>
+          </w:p>
+        </w:tc>
+        <w:tc>
+          <w:tcPr>
+            <w:tcW w:type="dxa" w:w="1417"/>
           </w:tcPr>
           <w:p>
             <w:pPr>
@@ -9542,7 +12019,7 @@
         </w:tc>
         <w:tc>
           <w:tcPr>
-            <w:tcW w:type="dxa" w:w="908"/>
+            <w:tcW w:type="dxa" w:w="909"/>
           </w:tcPr>
           <w:p>
             <w:pPr>
@@ -9552,7 +12029,7 @@
               <w:rPr>
                 <w:sz w:val="19"/>
               </w:rPr>
-              <w:t>Day 4</w:t>
+              <w:t>Day 2</w:t>
             </w:r>
           </w:p>
         </w:tc>
@@ -9563,7 +12040,7 @@
         </w:trPr>
         <w:tc>
           <w:tcPr>
-            <w:tcW w:type="dxa" w:w="1880"/>
+            <w:tcW w:type="dxa" w:w="1886"/>
           </w:tcPr>
           <w:p>
             <w:pPr>
@@ -9574,13 +12051,13 @@
                 <w:b/>
                 <w:sz w:val="19"/>
               </w:rPr>
-              <w:t>Findability</w:t>
-            </w:r>
-          </w:p>
-        </w:tc>
-        <w:tc>
-          <w:tcPr>
-            <w:tcW w:type="dxa" w:w="5427"/>
+              <w:t>Decision effort</w:t>
+            </w:r>
+          </w:p>
+        </w:tc>
+        <w:tc>
+          <w:tcPr>
+            <w:tcW w:type="dxa" w:w="5426"/>
           </w:tcPr>
           <w:p>
             <w:pPr>
@@ -9590,13 +12067,13 @@
               <w:rPr>
                 <w:sz w:val="19"/>
               </w:rPr>
-              <w:t>How easily people can find what they are looking for, by browsing the menu or by searching.</w:t>
-            </w:r>
-          </w:p>
-        </w:tc>
-        <w:tc>
-          <w:tcPr>
-            <w:tcW w:type="dxa" w:w="1423"/>
+              <w:t>The mental work of comparing options and choosing one. Many equal options raise it.</w:t>
+            </w:r>
+          </w:p>
+        </w:tc>
+        <w:tc>
+          <w:tcPr>
+            <w:tcW w:type="dxa" w:w="1417"/>
           </w:tcPr>
           <w:p>
             <w:pPr>
@@ -9612,7 +12089,7 @@
         </w:tc>
         <w:tc>
           <w:tcPr>
-            <w:tcW w:type="dxa" w:w="908"/>
+            <w:tcW w:type="dxa" w:w="909"/>
           </w:tcPr>
           <w:p>
             <w:pPr>
@@ -9622,7 +12099,7 @@
               <w:rPr>
                 <w:sz w:val="19"/>
               </w:rPr>
-              <w:t>Day 2</w:t>
+              <w:t>Day 4</w:t>
             </w:r>
           </w:p>
         </w:tc>
@@ -9633,7 +12110,7 @@
         </w:trPr>
         <w:tc>
           <w:tcPr>
-            <w:tcW w:type="dxa" w:w="1880"/>
+            <w:tcW w:type="dxa" w:w="1886"/>
           </w:tcPr>
           <w:p>
             <w:pPr>
@@ -9644,13 +12121,13 @@
                 <w:b/>
                 <w:sz w:val="19"/>
               </w:rPr>
-              <w:t>Fitts's law</w:t>
-            </w:r>
-          </w:p>
-        </w:tc>
-        <w:tc>
-          <w:tcPr>
-            <w:tcW w:type="dxa" w:w="5427"/>
+              <w:t>Findability</w:t>
+            </w:r>
+          </w:p>
+        </w:tc>
+        <w:tc>
+          <w:tcPr>
+            <w:tcW w:type="dxa" w:w="5426"/>
           </w:tcPr>
           <w:p>
             <w:pPr>
@@ -9660,13 +12137,13 @@
               <w:rPr>
                 <w:sz w:val="19"/>
               </w:rPr>
-              <w:t>A target is reached faster and missed less often when it is large and close. Small, distant buttons cost time and cause wrong taps.</w:t>
-            </w:r>
-          </w:p>
-        </w:tc>
-        <w:tc>
-          <w:tcPr>
-            <w:tcW w:type="dxa" w:w="1423"/>
+              <w:t>How easily people can find what they are looking for, by browsing the menu or by searching.</w:t>
+            </w:r>
+          </w:p>
+        </w:tc>
+        <w:tc>
+          <w:tcPr>
+            <w:tcW w:type="dxa" w:w="1417"/>
           </w:tcPr>
           <w:p>
             <w:pPr>
@@ -9682,7 +12159,7 @@
         </w:tc>
         <w:tc>
           <w:tcPr>
-            <w:tcW w:type="dxa" w:w="908"/>
+            <w:tcW w:type="dxa" w:w="909"/>
           </w:tcPr>
           <w:p>
             <w:pPr>
@@ -9692,7 +12169,7 @@
               <w:rPr>
                 <w:sz w:val="19"/>
               </w:rPr>
-              <w:t>Day 4</w:t>
+              <w:t>Day 2</w:t>
             </w:r>
           </w:p>
         </w:tc>
@@ -9703,7 +12180,7 @@
         </w:trPr>
         <w:tc>
           <w:tcPr>
-            <w:tcW w:type="dxa" w:w="1880"/>
+            <w:tcW w:type="dxa" w:w="1886"/>
           </w:tcPr>
           <w:p>
             <w:pPr>
@@ -9714,13 +12191,13 @@
                 <w:b/>
                 <w:sz w:val="19"/>
               </w:rPr>
-              <w:t>Friction</w:t>
-            </w:r>
-          </w:p>
-        </w:tc>
-        <w:tc>
-          <w:tcPr>
-            <w:tcW w:type="dxa" w:w="5427"/>
+              <w:t>Fitts's law</w:t>
+            </w:r>
+          </w:p>
+        </w:tc>
+        <w:tc>
+          <w:tcPr>
+            <w:tcW w:type="dxa" w:w="5426"/>
           </w:tcPr>
           <w:p>
             <w:pPr>
@@ -9730,13 +12207,13 @@
               <w:rPr>
                 <w:sz w:val="19"/>
               </w:rPr>
-              <w:t>Everything that slows people down or makes them think about the interface instead of their task: searching, choosing, remembering, guessing.</w:t>
-            </w:r>
-          </w:p>
-        </w:tc>
-        <w:tc>
-          <w:tcPr>
-            <w:tcW w:type="dxa" w:w="1423"/>
+              <w:t>A target is reached faster and missed less often when it is large and close. Small, distant buttons cost time and cause wrong taps.</w:t>
+            </w:r>
+          </w:p>
+        </w:tc>
+        <w:tc>
+          <w:tcPr>
+            <w:tcW w:type="dxa" w:w="1417"/>
           </w:tcPr>
           <w:p>
             <w:pPr>
@@ -9752,7 +12229,7 @@
         </w:tc>
         <w:tc>
           <w:tcPr>
-            <w:tcW w:type="dxa" w:w="908"/>
+            <w:tcW w:type="dxa" w:w="909"/>
           </w:tcPr>
           <w:p>
             <w:pPr>
@@ -9773,7 +12250,7 @@
         </w:trPr>
         <w:tc>
           <w:tcPr>
-            <w:tcW w:type="dxa" w:w="1880"/>
+            <w:tcW w:type="dxa" w:w="1886"/>
           </w:tcPr>
           <w:p>
             <w:pPr>
@@ -9784,13 +12261,13 @@
                 <w:b/>
                 <w:sz w:val="19"/>
               </w:rPr>
-              <w:t>Governance</w:t>
-            </w:r>
-          </w:p>
-        </w:tc>
-        <w:tc>
-          <w:tcPr>
-            <w:tcW w:type="dxa" w:w="5427"/>
+              <w:t>Friction</w:t>
+            </w:r>
+          </w:p>
+        </w:tc>
+        <w:tc>
+          <w:tcPr>
+            <w:tcW w:type="dxa" w:w="5426"/>
           </w:tcPr>
           <w:p>
             <w:pPr>
@@ -9800,13 +12277,13 @@
               <w:rPr>
                 <w:sz w:val="19"/>
               </w:rPr>
-              <w:t>The rules about who may decide what, who is answerable for it and how disagreements are settled.</w:t>
-            </w:r>
-          </w:p>
-        </w:tc>
-        <w:tc>
-          <w:tcPr>
-            <w:tcW w:type="dxa" w:w="1423"/>
+              <w:t>Everything that slows people down or makes them think about the interface instead of their task: searching, choosing, remembering, guessing.</w:t>
+            </w:r>
+          </w:p>
+        </w:tc>
+        <w:tc>
+          <w:tcPr>
+            <w:tcW w:type="dxa" w:w="1417"/>
           </w:tcPr>
           <w:p>
             <w:pPr>
@@ -9822,7 +12299,7 @@
         </w:tc>
         <w:tc>
           <w:tcPr>
-            <w:tcW w:type="dxa" w:w="908"/>
+            <w:tcW w:type="dxa" w:w="909"/>
           </w:tcPr>
           <w:p>
             <w:pPr>
@@ -9832,7 +12309,7 @@
               <w:rPr>
                 <w:sz w:val="19"/>
               </w:rPr>
-              <w:t>Day 1</w:t>
+              <w:t>Day 4</w:t>
             </w:r>
           </w:p>
         </w:tc>
@@ -9843,7 +12320,7 @@
         </w:trPr>
         <w:tc>
           <w:tcPr>
-            <w:tcW w:type="dxa" w:w="1880"/>
+            <w:tcW w:type="dxa" w:w="1886"/>
           </w:tcPr>
           <w:p>
             <w:pPr>
@@ -9854,13 +12331,13 @@
                 <w:b/>
                 <w:sz w:val="19"/>
               </w:rPr>
-              <w:t>Grouping</w:t>
-            </w:r>
-          </w:p>
-        </w:tc>
-        <w:tc>
-          <w:tcPr>
-            <w:tcW w:type="dxa" w:w="5427"/>
+              <w:t>Governance</w:t>
+            </w:r>
+          </w:p>
+        </w:tc>
+        <w:tc>
+          <w:tcPr>
+            <w:tcW w:type="dxa" w:w="5426"/>
           </w:tcPr>
           <w:p>
             <w:pPr>
@@ -9870,13 +12347,13 @@
               <w:rPr>
                 <w:sz w:val="19"/>
               </w:rPr>
-              <w:t>Showing what belongs together, for example by putting it close together or making it look alike. The eye reads a group as one unit.</w:t>
-            </w:r>
-          </w:p>
-        </w:tc>
-        <w:tc>
-          <w:tcPr>
-            <w:tcW w:type="dxa" w:w="1423"/>
+              <w:t>The rules about who may decide what, who is answerable for it and how disagreements are settled.</w:t>
+            </w:r>
+          </w:p>
+        </w:tc>
+        <w:tc>
+          <w:tcPr>
+            <w:tcW w:type="dxa" w:w="1417"/>
           </w:tcPr>
           <w:p>
             <w:pPr>
@@ -9892,7 +12369,7 @@
         </w:tc>
         <w:tc>
           <w:tcPr>
-            <w:tcW w:type="dxa" w:w="908"/>
+            <w:tcW w:type="dxa" w:w="909"/>
           </w:tcPr>
           <w:p>
             <w:pPr>
@@ -9902,7 +12379,7 @@
               <w:rPr>
                 <w:sz w:val="19"/>
               </w:rPr>
-              <w:t>Day 2</w:t>
+              <w:t>Day 1</w:t>
             </w:r>
           </w:p>
         </w:tc>
@@ -9913,7 +12390,7 @@
         </w:trPr>
         <w:tc>
           <w:tcPr>
-            <w:tcW w:type="dxa" w:w="1880"/>
+            <w:tcW w:type="dxa" w:w="1886"/>
           </w:tcPr>
           <w:p>
             <w:pPr>
@@ -9924,13 +12401,13 @@
                 <w:b/>
                 <w:sz w:val="19"/>
               </w:rPr>
-              <w:t>Hick's law</w:t>
-            </w:r>
-          </w:p>
-        </w:tc>
-        <w:tc>
-          <w:tcPr>
-            <w:tcW w:type="dxa" w:w="5427"/>
+              <w:t>Grouping</w:t>
+            </w:r>
+          </w:p>
+        </w:tc>
+        <w:tc>
+          <w:tcPr>
+            <w:tcW w:type="dxa" w:w="5426"/>
           </w:tcPr>
           <w:p>
             <w:pPr>
@@ -9940,13 +12417,13 @@
               <w:rPr>
                 <w:sz w:val="19"/>
               </w:rPr>
-              <w:t>The more equally weighted options people have to choose from, the longer the decision takes. It matters most for unfamiliar options that look alike.</w:t>
-            </w:r>
-          </w:p>
-        </w:tc>
-        <w:tc>
-          <w:tcPr>
-            <w:tcW w:type="dxa" w:w="1423"/>
+              <w:t>Showing what belongs together, for example by putting it close together or making it look alike. The eye reads a group as one unit.</w:t>
+            </w:r>
+          </w:p>
+        </w:tc>
+        <w:tc>
+          <w:tcPr>
+            <w:tcW w:type="dxa" w:w="1417"/>
           </w:tcPr>
           <w:p>
             <w:pPr>
@@ -9962,7 +12439,7 @@
         </w:tc>
         <w:tc>
           <w:tcPr>
-            <w:tcW w:type="dxa" w:w="908"/>
+            <w:tcW w:type="dxa" w:w="909"/>
           </w:tcPr>
           <w:p>
             <w:pPr>
@@ -9972,7 +12449,7 @@
               <w:rPr>
                 <w:sz w:val="19"/>
               </w:rPr>
-              <w:t>Day 4</w:t>
+              <w:t>Day 2</w:t>
             </w:r>
           </w:p>
         </w:tc>
@@ -9983,7 +12460,7 @@
         </w:trPr>
         <w:tc>
           <w:tcPr>
-            <w:tcW w:type="dxa" w:w="1880"/>
+            <w:tcW w:type="dxa" w:w="1886"/>
           </w:tcPr>
           <w:p>
             <w:pPr>
@@ -9994,13 +12471,13 @@
                 <w:b/>
                 <w:sz w:val="19"/>
               </w:rPr>
-              <w:t>Intuitive use</w:t>
-            </w:r>
-          </w:p>
-        </w:tc>
-        <w:tc>
-          <w:tcPr>
-            <w:tcW w:type="dxa" w:w="5427"/>
+              <w:t>Hick's law</w:t>
+            </w:r>
+          </w:p>
+        </w:tc>
+        <w:tc>
+          <w:tcPr>
+            <w:tcW w:type="dxa" w:w="5426"/>
           </w:tcPr>
           <w:p>
             <w:pPr>
@@ -10010,13 +12487,13 @@
               <w:rPr>
                 <w:sz w:val="19"/>
               </w:rPr>
-              <w:t>Use that works without thinking about the interface: people find what they need, know what to do next and know when they are done. It is designed, not a matter of luck.</w:t>
-            </w:r>
-          </w:p>
-        </w:tc>
-        <w:tc>
-          <w:tcPr>
-            <w:tcW w:type="dxa" w:w="1423"/>
+              <w:t>The more equally weighted options people have to choose from, the longer the decision takes. It matters most for unfamiliar options that look alike.</w:t>
+            </w:r>
+          </w:p>
+        </w:tc>
+        <w:tc>
+          <w:tcPr>
+            <w:tcW w:type="dxa" w:w="1417"/>
           </w:tcPr>
           <w:p>
             <w:pPr>
@@ -10032,7 +12509,7 @@
         </w:tc>
         <w:tc>
           <w:tcPr>
-            <w:tcW w:type="dxa" w:w="908"/>
+            <w:tcW w:type="dxa" w:w="909"/>
           </w:tcPr>
           <w:p>
             <w:pPr>
@@ -10053,7 +12530,7 @@
         </w:trPr>
         <w:tc>
           <w:tcPr>
-            <w:tcW w:type="dxa" w:w="1880"/>
+            <w:tcW w:type="dxa" w:w="1886"/>
           </w:tcPr>
           <w:p>
             <w:pPr>
@@ -10064,13 +12541,13 @@
                 <w:b/>
                 <w:sz w:val="19"/>
               </w:rPr>
-              <w:t>Jakob's law</w:t>
-            </w:r>
-          </w:p>
-        </w:tc>
-        <w:tc>
-          <w:tcPr>
-            <w:tcW w:type="dxa" w:w="5427"/>
+              <w:t>Intuitive use</w:t>
+            </w:r>
+          </w:p>
+        </w:tc>
+        <w:tc>
+          <w:tcPr>
+            <w:tcW w:type="dxa" w:w="5426"/>
           </w:tcPr>
           <w:p>
             <w:pPr>
@@ -10080,13 +12557,13 @@
               <w:rPr>
                 <w:sz w:val="19"/>
               </w:rPr>
-              <w:t>People spend most of their time on other products, so they expect yours to work the same way. Familiar patterns need no learning.</w:t>
-            </w:r>
-          </w:p>
-        </w:tc>
-        <w:tc>
-          <w:tcPr>
-            <w:tcW w:type="dxa" w:w="1423"/>
+              <w:t>Use that works without thinking about the interface: people find what they need, know what to do next and know when they are done. It is designed, not a matter of luck.</w:t>
+            </w:r>
+          </w:p>
+        </w:tc>
+        <w:tc>
+          <w:tcPr>
+            <w:tcW w:type="dxa" w:w="1417"/>
           </w:tcPr>
           <w:p>
             <w:pPr>
@@ -10102,7 +12579,7 @@
         </w:tc>
         <w:tc>
           <w:tcPr>
-            <w:tcW w:type="dxa" w:w="908"/>
+            <w:tcW w:type="dxa" w:w="909"/>
           </w:tcPr>
           <w:p>
             <w:pPr>
@@ -10123,7 +12600,7 @@
         </w:trPr>
         <w:tc>
           <w:tcPr>
-            <w:tcW w:type="dxa" w:w="1880"/>
+            <w:tcW w:type="dxa" w:w="1886"/>
           </w:tcPr>
           <w:p>
             <w:pPr>
@@ -10134,13 +12611,13 @@
                 <w:b/>
                 <w:sz w:val="19"/>
               </w:rPr>
-              <w:t>Mental model</w:t>
-            </w:r>
-          </w:p>
-        </w:tc>
-        <w:tc>
-          <w:tcPr>
-            <w:tcW w:type="dxa" w:w="5427"/>
+              <w:t>Jakob's law</w:t>
+            </w:r>
+          </w:p>
+        </w:tc>
+        <w:tc>
+          <w:tcPr>
+            <w:tcW w:type="dxa" w:w="5426"/>
           </w:tcPr>
           <w:p>
             <w:pPr>
@@ -10150,13 +12627,13 @@
               <w:rPr>
                 <w:sz w:val="19"/>
               </w:rPr>
-              <w:t>What a person believes a product is and how it works. A design feels natural when it fits that belief and confusing when it does not.</w:t>
-            </w:r>
-          </w:p>
-        </w:tc>
-        <w:tc>
-          <w:tcPr>
-            <w:tcW w:type="dxa" w:w="1423"/>
+              <w:t>People spend most of their time on other products, so they expect yours to work the same way. Familiar patterns need no learning.</w:t>
+            </w:r>
+          </w:p>
+        </w:tc>
+        <w:tc>
+          <w:tcPr>
+            <w:tcW w:type="dxa" w:w="1417"/>
           </w:tcPr>
           <w:p>
             <w:pPr>
@@ -10166,13 +12643,13 @@
               <w:rPr>
                 <w:sz w:val="19"/>
               </w:rPr>
-              <w:t>Most people expect a basket icon to show what they have chosen so far.</w:t>
-            </w:r>
-          </w:p>
-        </w:tc>
-        <w:tc>
-          <w:tcPr>
-            <w:tcW w:type="dxa" w:w="908"/>
+              <w:t>—</w:t>
+            </w:r>
+          </w:p>
+        </w:tc>
+        <w:tc>
+          <w:tcPr>
+            <w:tcW w:type="dxa" w:w="909"/>
           </w:tcPr>
           <w:p>
             <w:pPr>
@@ -10182,7 +12659,7 @@
               <w:rPr>
                 <w:sz w:val="19"/>
               </w:rPr>
-              <w:t>Day 1</w:t>
+              <w:t>Day 4</w:t>
             </w:r>
           </w:p>
         </w:tc>
@@ -10193,7 +12670,7 @@
         </w:trPr>
         <w:tc>
           <w:tcPr>
-            <w:tcW w:type="dxa" w:w="1880"/>
+            <w:tcW w:type="dxa" w:w="1886"/>
           </w:tcPr>
           <w:p>
             <w:pPr>
@@ -10204,13 +12681,13 @@
                 <w:b/>
                 <w:sz w:val="19"/>
               </w:rPr>
-              <w:t>Miller's rule</w:t>
-            </w:r>
-          </w:p>
-        </w:tc>
-        <w:tc>
-          <w:tcPr>
-            <w:tcW w:type="dxa" w:w="5427"/>
+              <w:t>Mental model</w:t>
+            </w:r>
+          </w:p>
+        </w:tc>
+        <w:tc>
+          <w:tcPr>
+            <w:tcW w:type="dxa" w:w="5426"/>
           </w:tcPr>
           <w:p>
             <w:pPr>
@@ -10220,13 +12697,13 @@
               <w:rPr>
                 <w:sz w:val="19"/>
               </w:rPr>
-              <w:t>Short-term memory holds only a few things at once, about seven in Miller's old estimate and nearer four in later research. Interfaces should not make people remember what the system knows.</w:t>
-            </w:r>
-          </w:p>
-        </w:tc>
-        <w:tc>
-          <w:tcPr>
-            <w:tcW w:type="dxa" w:w="1423"/>
+              <w:t>What a person believes a product is and how it works. A design feels natural when it fits that belief and confusing when it does not.</w:t>
+            </w:r>
+          </w:p>
+        </w:tc>
+        <w:tc>
+          <w:tcPr>
+            <w:tcW w:type="dxa" w:w="1417"/>
           </w:tcPr>
           <w:p>
             <w:pPr>
@@ -10236,13 +12713,13 @@
               <w:rPr>
                 <w:sz w:val="19"/>
               </w:rPr>
-              <w:t>—</w:t>
-            </w:r>
-          </w:p>
-        </w:tc>
-        <w:tc>
-          <w:tcPr>
-            <w:tcW w:type="dxa" w:w="908"/>
+              <w:t>Most people expect a basket icon to show what they have chosen so far.</w:t>
+            </w:r>
+          </w:p>
+        </w:tc>
+        <w:tc>
+          <w:tcPr>
+            <w:tcW w:type="dxa" w:w="909"/>
           </w:tcPr>
           <w:p>
             <w:pPr>
@@ -10252,7 +12729,7 @@
               <w:rPr>
                 <w:sz w:val="19"/>
               </w:rPr>
-              <w:t>Day 4</w:t>
+              <w:t>Day 1</w:t>
             </w:r>
           </w:p>
         </w:tc>
@@ -10263,7 +12740,7 @@
         </w:trPr>
         <w:tc>
           <w:tcPr>
-            <w:tcW w:type="dxa" w:w="1880"/>
+            <w:tcW w:type="dxa" w:w="1886"/>
           </w:tcPr>
           <w:p>
             <w:pPr>
@@ -10274,13 +12751,13 @@
                 <w:b/>
                 <w:sz w:val="19"/>
               </w:rPr>
-              <w:t>Neuro-UX</w:t>
-            </w:r>
-          </w:p>
-        </w:tc>
-        <w:tc>
-          <w:tcPr>
-            <w:tcW w:type="dxa" w:w="5427"/>
+              <w:t>Miller's rule</w:t>
+            </w:r>
+          </w:p>
+        </w:tc>
+        <w:tc>
+          <w:tcPr>
+            <w:tcW w:type="dxa" w:w="5426"/>
           </w:tcPr>
           <w:p>
             <w:pPr>
@@ -10290,13 +12767,13 @@
               <w:rPr>
                 <w:sz w:val="19"/>
               </w:rPr>
-              <w:t>Designing an interface with knowledge of how the brain sees, attends, feels and decides, so that the design steers these processes on purpose and responsibly.</w:t>
-            </w:r>
-          </w:p>
-        </w:tc>
-        <w:tc>
-          <w:tcPr>
-            <w:tcW w:type="dxa" w:w="1423"/>
+              <w:t>Short-term memory holds only a few things at once, about seven in Miller's old estimate and nearer four in later research. Interfaces should not make people remember what the system knows.</w:t>
+            </w:r>
+          </w:p>
+        </w:tc>
+        <w:tc>
+          <w:tcPr>
+            <w:tcW w:type="dxa" w:w="1417"/>
           </w:tcPr>
           <w:p>
             <w:pPr>
@@ -10312,7 +12789,7 @@
         </w:tc>
         <w:tc>
           <w:tcPr>
-            <w:tcW w:type="dxa" w:w="908"/>
+            <w:tcW w:type="dxa" w:w="909"/>
           </w:tcPr>
           <w:p>
             <w:pPr>
@@ -10322,7 +12799,7 @@
               <w:rPr>
                 <w:sz w:val="19"/>
               </w:rPr>
-              <w:t>Day 1</w:t>
+              <w:t>Day 4</w:t>
             </w:r>
           </w:p>
         </w:tc>
@@ -10333,7 +12810,7 @@
         </w:trPr>
         <w:tc>
           <w:tcPr>
-            <w:tcW w:type="dxa" w:w="1880"/>
+            <w:tcW w:type="dxa" w:w="1886"/>
           </w:tcPr>
           <w:p>
             <w:pPr>
@@ -10344,13 +12821,13 @@
                 <w:b/>
                 <w:sz w:val="19"/>
               </w:rPr>
-              <w:t>Orientation</w:t>
-            </w:r>
-          </w:p>
-        </w:tc>
-        <w:tc>
-          <w:tcPr>
-            <w:tcW w:type="dxa" w:w="5427"/>
+              <w:t>Neuro-UX</w:t>
+            </w:r>
+          </w:p>
+        </w:tc>
+        <w:tc>
+          <w:tcPr>
+            <w:tcW w:type="dxa" w:w="5426"/>
           </w:tcPr>
           <w:p>
             <w:pPr>
@@ -10360,13 +12837,13 @@
               <w:rPr>
                 <w:sz w:val="19"/>
               </w:rPr>
-              <w:t>Knowing where you are, what you can do here and what happens next.</w:t>
-            </w:r>
-          </w:p>
-        </w:tc>
-        <w:tc>
-          <w:tcPr>
-            <w:tcW w:type="dxa" w:w="1423"/>
+              <w:t>Designing an interface with knowledge of how the brain sees, attends, feels and decides, so that the design steers these processes on purpose and responsibly.</w:t>
+            </w:r>
+          </w:p>
+        </w:tc>
+        <w:tc>
+          <w:tcPr>
+            <w:tcW w:type="dxa" w:w="1417"/>
           </w:tcPr>
           <w:p>
             <w:pPr>
@@ -10382,7 +12859,7 @@
         </w:tc>
         <w:tc>
           <w:tcPr>
-            <w:tcW w:type="dxa" w:w="908"/>
+            <w:tcW w:type="dxa" w:w="909"/>
           </w:tcPr>
           <w:p>
             <w:pPr>
@@ -10403,7 +12880,7 @@
         </w:trPr>
         <w:tc>
           <w:tcPr>
-            <w:tcW w:type="dxa" w:w="1880"/>
+            <w:tcW w:type="dxa" w:w="1886"/>
           </w:tcPr>
           <w:p>
             <w:pPr>
@@ -10414,13 +12891,13 @@
                 <w:b/>
                 <w:sz w:val="19"/>
               </w:rPr>
-              <w:t>Perception</w:t>
-            </w:r>
-          </w:p>
-        </w:tc>
-        <w:tc>
-          <w:tcPr>
-            <w:tcW w:type="dxa" w:w="5427"/>
+              <w:t>Orientation</w:t>
+            </w:r>
+          </w:p>
+        </w:tc>
+        <w:tc>
+          <w:tcPr>
+            <w:tcW w:type="dxa" w:w="5426"/>
           </w:tcPr>
           <w:p>
             <w:pPr>
@@ -10430,13 +12907,13 @@
               <w:rPr>
                 <w:sz w:val="19"/>
               </w:rPr>
-              <w:t>Taking in what the senses deliver, for example what the eyes see on a screen, before thinking about it.</w:t>
-            </w:r>
-          </w:p>
-        </w:tc>
-        <w:tc>
-          <w:tcPr>
-            <w:tcW w:type="dxa" w:w="1423"/>
+              <w:t>Knowing where you are, what you can do here and what happens next.</w:t>
+            </w:r>
+          </w:p>
+        </w:tc>
+        <w:tc>
+          <w:tcPr>
+            <w:tcW w:type="dxa" w:w="1417"/>
           </w:tcPr>
           <w:p>
             <w:pPr>
@@ -10452,7 +12929,7 @@
         </w:tc>
         <w:tc>
           <w:tcPr>
-            <w:tcW w:type="dxa" w:w="908"/>
+            <w:tcW w:type="dxa" w:w="909"/>
           </w:tcPr>
           <w:p>
             <w:pPr>
@@ -10473,7 +12950,7 @@
         </w:trPr>
         <w:tc>
           <w:tcPr>
-            <w:tcW w:type="dxa" w:w="1880"/>
+            <w:tcW w:type="dxa" w:w="1886"/>
           </w:tcPr>
           <w:p>
             <w:pPr>
@@ -10484,13 +12961,13 @@
                 <w:b/>
                 <w:sz w:val="19"/>
               </w:rPr>
-              <w:t>Primary action</w:t>
-            </w:r>
-          </w:p>
-        </w:tc>
-        <w:tc>
-          <w:tcPr>
-            <w:tcW w:type="dxa" w:w="5427"/>
+              <w:t>Perception</w:t>
+            </w:r>
+          </w:p>
+        </w:tc>
+        <w:tc>
+          <w:tcPr>
+            <w:tcW w:type="dxa" w:w="5426"/>
           </w:tcPr>
           <w:p>
             <w:pPr>
@@ -10500,13 +12977,13 @@
               <w:rPr>
                 <w:sz w:val="19"/>
               </w:rPr>
-              <w:t>The one thing most people on a screen came to do, such as “Report damage”. It should be the easiest thing to see and press.</w:t>
-            </w:r>
-          </w:p>
-        </w:tc>
-        <w:tc>
-          <w:tcPr>
-            <w:tcW w:type="dxa" w:w="1423"/>
+              <w:t>Taking in what the senses deliver, for example what the eyes see on a screen, before thinking about it.</w:t>
+            </w:r>
+          </w:p>
+        </w:tc>
+        <w:tc>
+          <w:tcPr>
+            <w:tcW w:type="dxa" w:w="1417"/>
           </w:tcPr>
           <w:p>
             <w:pPr>
@@ -10522,7 +12999,7 @@
         </w:tc>
         <w:tc>
           <w:tcPr>
-            <w:tcW w:type="dxa" w:w="908"/>
+            <w:tcW w:type="dxa" w:w="909"/>
           </w:tcPr>
           <w:p>
             <w:pPr>
@@ -10543,7 +13020,7 @@
         </w:trPr>
         <w:tc>
           <w:tcPr>
-            <w:tcW w:type="dxa" w:w="1880"/>
+            <w:tcW w:type="dxa" w:w="1886"/>
           </w:tcPr>
           <w:p>
             <w:pPr>
@@ -10554,13 +13031,13 @@
                 <w:b/>
                 <w:sz w:val="19"/>
               </w:rPr>
-              <w:t>Progressive disclosure</w:t>
-            </w:r>
-          </w:p>
-        </w:tc>
-        <w:tc>
-          <w:tcPr>
-            <w:tcW w:type="dxa" w:w="5427"/>
+              <w:t>Primary action</w:t>
+            </w:r>
+          </w:p>
+        </w:tc>
+        <w:tc>
+          <w:tcPr>
+            <w:tcW w:type="dxa" w:w="5426"/>
           </w:tcPr>
           <w:p>
             <w:pPr>
@@ -10570,13 +13047,13 @@
               <w:rPr>
                 <w:sz w:val="19"/>
               </w:rPr>
-              <w:t>Showing the few most important things first and the rest one step deeper, on request, so the first screen stays clear.</w:t>
-            </w:r>
-          </w:p>
-        </w:tc>
-        <w:tc>
-          <w:tcPr>
-            <w:tcW w:type="dxa" w:w="1423"/>
+              <w:t>The one thing most people on a screen came to do, such as “Report damage”. It should be the easiest thing to see and press.</w:t>
+            </w:r>
+          </w:p>
+        </w:tc>
+        <w:tc>
+          <w:tcPr>
+            <w:tcW w:type="dxa" w:w="1417"/>
           </w:tcPr>
           <w:p>
             <w:pPr>
@@ -10592,7 +13069,7 @@
         </w:tc>
         <w:tc>
           <w:tcPr>
-            <w:tcW w:type="dxa" w:w="908"/>
+            <w:tcW w:type="dxa" w:w="909"/>
           </w:tcPr>
           <w:p>
             <w:pPr>
@@ -10602,7 +13079,7 @@
               <w:rPr>
                 <w:sz w:val="19"/>
               </w:rPr>
-              <w:t>Day 2</w:t>
+              <w:t>Day 1</w:t>
             </w:r>
           </w:p>
         </w:tc>
@@ -10613,7 +13090,7 @@
         </w:trPr>
         <w:tc>
           <w:tcPr>
-            <w:tcW w:type="dxa" w:w="1880"/>
+            <w:tcW w:type="dxa" w:w="1886"/>
           </w:tcPr>
           <w:p>
             <w:pPr>
@@ -10624,13 +13101,13 @@
                 <w:b/>
                 <w:sz w:val="19"/>
               </w:rPr>
-              <w:t>Recognition instead of recall</w:t>
-            </w:r>
-          </w:p>
-        </w:tc>
-        <w:tc>
-          <w:tcPr>
-            <w:tcW w:type="dxa" w:w="5427"/>
+              <w:t>Progressive disclosure</w:t>
+            </w:r>
+          </w:p>
+        </w:tc>
+        <w:tc>
+          <w:tcPr>
+            <w:tcW w:type="dxa" w:w="5426"/>
           </w:tcPr>
           <w:p>
             <w:pPr>
@@ -10640,13 +13117,13 @@
               <w:rPr>
                 <w:sz w:val="19"/>
               </w:rPr>
-              <w:t>Showing people the options and the next step so they can recognise them, instead of making them remember or hunt for them.</w:t>
-            </w:r>
-          </w:p>
-        </w:tc>
-        <w:tc>
-          <w:tcPr>
-            <w:tcW w:type="dxa" w:w="1423"/>
+              <w:t>Showing the few most important things first and the rest one step deeper, on request, so the first screen stays clear.</w:t>
+            </w:r>
+          </w:p>
+        </w:tc>
+        <w:tc>
+          <w:tcPr>
+            <w:tcW w:type="dxa" w:w="1417"/>
           </w:tcPr>
           <w:p>
             <w:pPr>
@@ -10662,7 +13139,7 @@
         </w:tc>
         <w:tc>
           <w:tcPr>
-            <w:tcW w:type="dxa" w:w="908"/>
+            <w:tcW w:type="dxa" w:w="909"/>
           </w:tcPr>
           <w:p>
             <w:pPr>
@@ -10683,7 +13160,7 @@
         </w:trPr>
         <w:tc>
           <w:tcPr>
-            <w:tcW w:type="dxa" w:w="1880"/>
+            <w:tcW w:type="dxa" w:w="1886"/>
           </w:tcPr>
           <w:p>
             <w:pPr>
@@ -10694,13 +13171,13 @@
                 <w:b/>
                 <w:sz w:val="19"/>
               </w:rPr>
-              <w:t>Self-service portal</w:t>
-            </w:r>
-          </w:p>
-        </w:tc>
-        <w:tc>
-          <w:tcPr>
-            <w:tcW w:type="dxa" w:w="5427"/>
+              <w:t>Recognition instead of recall</w:t>
+            </w:r>
+          </w:p>
+        </w:tc>
+        <w:tc>
+          <w:tcPr>
+            <w:tcW w:type="dxa" w:w="5426"/>
           </w:tcPr>
           <w:p>
             <w:pPr>
@@ -10710,13 +13187,13 @@
               <w:rPr>
                 <w:sz w:val="19"/>
               </w:rPr>
-              <w:t>A website where customers do things themselves that once needed a call or a visit, such as reporting damage or downloading a document.</w:t>
-            </w:r>
-          </w:p>
-        </w:tc>
-        <w:tc>
-          <w:tcPr>
-            <w:tcW w:type="dxa" w:w="1423"/>
+              <w:t>Showing people the options and the next step so they can recognise them, instead of making them remember or hunt for them.</w:t>
+            </w:r>
+          </w:p>
+        </w:tc>
+        <w:tc>
+          <w:tcPr>
+            <w:tcW w:type="dxa" w:w="1417"/>
           </w:tcPr>
           <w:p>
             <w:pPr>
@@ -10732,7 +13209,7 @@
         </w:tc>
         <w:tc>
           <w:tcPr>
-            <w:tcW w:type="dxa" w:w="908"/>
+            <w:tcW w:type="dxa" w:w="909"/>
           </w:tcPr>
           <w:p>
             <w:pPr>
@@ -10742,7 +13219,7 @@
               <w:rPr>
                 <w:sz w:val="19"/>
               </w:rPr>
-              <w:t>Day 1</w:t>
+              <w:t>Day 2</w:t>
             </w:r>
           </w:p>
         </w:tc>
@@ -10753,7 +13230,7 @@
         </w:trPr>
         <w:tc>
           <w:tcPr>
-            <w:tcW w:type="dxa" w:w="1880"/>
+            <w:tcW w:type="dxa" w:w="1886"/>
           </w:tcPr>
           <w:p>
             <w:pPr>
@@ -10764,13 +13241,13 @@
                 <w:b/>
                 <w:sz w:val="19"/>
               </w:rPr>
-              <w:t>UX (user experience)</w:t>
-            </w:r>
-          </w:p>
-        </w:tc>
-        <w:tc>
-          <w:tcPr>
-            <w:tcW w:type="dxa" w:w="5427"/>
+              <w:t>Self-service portal</w:t>
+            </w:r>
+          </w:p>
+        </w:tc>
+        <w:tc>
+          <w:tcPr>
+            <w:tcW w:type="dxa" w:w="5426"/>
           </w:tcPr>
           <w:p>
             <w:pPr>
@@ -10780,13 +13257,13 @@
               <w:rPr>
                 <w:sz w:val="19"/>
               </w:rPr>
-              <w:t>Everything a person goes through when using a product: what they notice, understand, feel and do, from the first look to the last step. The screens are only one part of it.</w:t>
-            </w:r>
-          </w:p>
-        </w:tc>
-        <w:tc>
-          <w:tcPr>
-            <w:tcW w:type="dxa" w:w="1423"/>
+              <w:t>A website where customers do things themselves that once needed a call or a visit, such as reporting damage or downloading a document.</w:t>
+            </w:r>
+          </w:p>
+        </w:tc>
+        <w:tc>
+          <w:tcPr>
+            <w:tcW w:type="dxa" w:w="1417"/>
           </w:tcPr>
           <w:p>
             <w:pPr>
@@ -10796,13 +13273,13 @@
               <w:rPr>
                 <w:sz w:val="19"/>
               </w:rPr>
-              <w:t>Finding the booking you want at once and feeling sure it went through is a good UX.</w:t>
-            </w:r>
-          </w:p>
-        </w:tc>
-        <w:tc>
-          <w:tcPr>
-            <w:tcW w:type="dxa" w:w="908"/>
+              <w:t>—</w:t>
+            </w:r>
+          </w:p>
+        </w:tc>
+        <w:tc>
+          <w:tcPr>
+            <w:tcW w:type="dxa" w:w="909"/>
           </w:tcPr>
           <w:p>
             <w:pPr>
@@ -10823,7 +13300,7 @@
         </w:trPr>
         <w:tc>
           <w:tcPr>
-            <w:tcW w:type="dxa" w:w="1880"/>
+            <w:tcW w:type="dxa" w:w="1886"/>
           </w:tcPr>
           <w:p>
             <w:pPr>
@@ -10834,13 +13311,13 @@
                 <w:b/>
                 <w:sz w:val="19"/>
               </w:rPr>
-              <w:t>UX law</w:t>
-            </w:r>
-          </w:p>
-        </w:tc>
-        <w:tc>
-          <w:tcPr>
-            <w:tcW w:type="dxa" w:w="5427"/>
+              <w:t>UX (user experience)</w:t>
+            </w:r>
+          </w:p>
+        </w:tc>
+        <w:tc>
+          <w:tcPr>
+            <w:tcW w:type="dxa" w:w="5426"/>
           </w:tcPr>
           <w:p>
             <w:pPr>
@@ -10850,13 +13327,13 @@
               <w:rPr>
                 <w:sz w:val="19"/>
               </w:rPr>
-              <w:t>A well-tested finding about how people perceive, decide or act, used as a rule of thumb in design, such as Hick's law or Fitts's law. It explains why something is hard; it does not replace looking at the users.</w:t>
-            </w:r>
-          </w:p>
-        </w:tc>
-        <w:tc>
-          <w:tcPr>
-            <w:tcW w:type="dxa" w:w="1423"/>
+              <w:t>Everything a person goes through when using a product: what they notice, understand, feel and do, from the first look to the last step. The screens are only one part of it.</w:t>
+            </w:r>
+          </w:p>
+        </w:tc>
+        <w:tc>
+          <w:tcPr>
+            <w:tcW w:type="dxa" w:w="1417"/>
           </w:tcPr>
           <w:p>
             <w:pPr>
@@ -10866,13 +13343,13 @@
               <w:rPr>
                 <w:sz w:val="19"/>
               </w:rPr>
-              <w:t>—</w:t>
-            </w:r>
-          </w:p>
-        </w:tc>
-        <w:tc>
-          <w:tcPr>
-            <w:tcW w:type="dxa" w:w="908"/>
+              <w:t>Finding the booking you want at once and feeling sure it went through is a good UX.</w:t>
+            </w:r>
+          </w:p>
+        </w:tc>
+        <w:tc>
+          <w:tcPr>
+            <w:tcW w:type="dxa" w:w="909"/>
           </w:tcPr>
           <w:p>
             <w:pPr>
@@ -10882,7 +13359,7 @@
               <w:rPr>
                 <w:sz w:val="19"/>
               </w:rPr>
-              <w:t>Day 4</w:t>
+              <w:t>Day 1</w:t>
             </w:r>
           </w:p>
         </w:tc>
@@ -10893,7 +13370,7 @@
         </w:trPr>
         <w:tc>
           <w:tcPr>
-            <w:tcW w:type="dxa" w:w="1880"/>
+            <w:tcW w:type="dxa" w:w="1886"/>
           </w:tcPr>
           <w:p>
             <w:pPr>
@@ -10904,13 +13381,83 @@
                 <w:b/>
                 <w:sz w:val="19"/>
               </w:rPr>
+              <w:t>UX law</w:t>
+            </w:r>
+          </w:p>
+        </w:tc>
+        <w:tc>
+          <w:tcPr>
+            <w:tcW w:type="dxa" w:w="5426"/>
+          </w:tcPr>
+          <w:p>
+            <w:pPr>
+              <w:spacing w:before="0" w:after="0"/>
+            </w:pPr>
+            <w:r>
+              <w:rPr>
+                <w:sz w:val="19"/>
+              </w:rPr>
+              <w:t>A well-tested finding about how people perceive, decide or act, used as a rule of thumb in design, such as Hick's law or Fitts's law. It explains why something is hard; it does not replace looking at the users.</w:t>
+            </w:r>
+          </w:p>
+        </w:tc>
+        <w:tc>
+          <w:tcPr>
+            <w:tcW w:type="dxa" w:w="1417"/>
+          </w:tcPr>
+          <w:p>
+            <w:pPr>
+              <w:spacing w:before="0" w:after="0"/>
+            </w:pPr>
+            <w:r>
+              <w:rPr>
+                <w:sz w:val="19"/>
+              </w:rPr>
+              <w:t>—</w:t>
+            </w:r>
+          </w:p>
+        </w:tc>
+        <w:tc>
+          <w:tcPr>
+            <w:tcW w:type="dxa" w:w="909"/>
+          </w:tcPr>
+          <w:p>
+            <w:pPr>
+              <w:spacing w:before="0" w:after="0"/>
+            </w:pPr>
+            <w:r>
+              <w:rPr>
+                <w:sz w:val="19"/>
+              </w:rPr>
+              <w:t>Day 4</w:t>
+            </w:r>
+          </w:p>
+        </w:tc>
+      </w:tr>
+      <w:tr>
+        <w:trPr>
+          <w:cantSplit/>
+        </w:trPr>
+        <w:tc>
+          <w:tcPr>
+            <w:tcW w:type="dxa" w:w="1886"/>
+          </w:tcPr>
+          <w:p>
+            <w:pPr>
+              <w:spacing w:before="0" w:after="0"/>
+            </w:pPr>
+            <w:r>
+              <w:rPr>
+                <w:b/>
+                <w:sz w:val="19"/>
+              </w:rPr>
               <w:t>Working memory</w:t>
             </w:r>
           </w:p>
         </w:tc>
         <w:tc>
           <w:tcPr>
-            <w:tcW w:type="dxa" w:w="5427"/>
+            <w:tcW w:type="dxa" w:w="5426"/>
           </w:tcPr>
           <w:p>
             <w:pPr>
@@ -10926,7 +13473,7 @@
         </w:tc>
         <w:tc>
           <w:tcPr>
-            <w:tcW w:type="dxa" w:w="1423"/>
+            <w:tcW w:type="dxa" w:w="1417"/>
           </w:tcPr>
           <w:p>
             <w:pPr>
@@ -10942,7 +13489,7 @@
         </w:tc>
         <w:tc>
           <w:tcPr>
-            <w:tcW w:type="dxa" w:w="908"/>
+            <w:tcW w:type="dxa" w:w="909"/>
           </w:tcPr>
           <w:p>
             <w:pPr>

</xml_diff>